<commit_message>
feat: early-stop truncation study and human sign-off Excel sheet
- Early-stop contrast: fixed round-robin truncated to 16/32/60 messages.
  All three budgets give identical results (20/40 correct, ID1/25 right,
  ID5/7 wrong), showing consensus solidifies in the first rounds and the
  remaining 44 speeches add nothing - early stopping is safe and saves
  ~2/3 of the speech budget.
- Excel sign-off sheet for the 144-item blind review: blind (no AI/rule
  labels), per-row 是/否 drop-down, evidence ID/quote columns, instructions
  sheet; designed for a human annotator to complete.
- Master report now covers the full 10-condition matrix including the
  early-stop arms.
</commit_message>
<xml_diff>
--- a/reports/实验总报告（自老师提要求以来）_2026-08-03.docx
+++ b/reports/实验总报告（自老师提要求以来）_2026-08-03.docx
@@ -517,8 +517,8 @@
       </w:tblPr>
       <w:tblGrid>
         <w:gridCol w:w="2300"/>
-        <w:gridCol w:w="3400"/>
-        <w:gridCol w:w="3660"/>
+        <w:gridCol w:w="3300"/>
+        <w:gridCol w:w="3760"/>
       </w:tblGrid>
       <w:tr>
         <w:trPr>
@@ -554,7 +554,7 @@
         </w:tc>
         <w:tc>
           <w:tcPr>
-            <w:tcW w:type="dxa" w:w="3400"/>
+            <w:tcW w:type="dxa" w:w="3300"/>
             <w:tcMar>
               <w:top w:w="80" w:type="dxa"/>
               <w:start w:w="120" w:type="dxa"/>
@@ -582,7 +582,7 @@
         </w:tc>
         <w:tc>
           <w:tcPr>
-            <w:tcW w:type="dxa" w:w="3660"/>
+            <w:tcW w:type="dxa" w:w="3760"/>
             <w:tcMar>
               <w:top w:w="80" w:type="dxa"/>
               <w:start w:w="120" w:type="dxa"/>
@@ -641,7 +641,7 @@
         </w:tc>
         <w:tc>
           <w:tcPr>
-            <w:tcW w:type="dxa" w:w="3400"/>
+            <w:tcW w:type="dxa" w:w="3300"/>
             <w:tcMar>
               <w:top w:w="80" w:type="dxa"/>
               <w:start w:w="120" w:type="dxa"/>
@@ -668,7 +668,7 @@
         </w:tc>
         <w:tc>
           <w:tcPr>
-            <w:tcW w:type="dxa" w:w="3660"/>
+            <w:tcW w:type="dxa" w:w="3760"/>
             <w:tcMar>
               <w:top w:w="80" w:type="dxa"/>
               <w:start w:w="120" w:type="dxa"/>
@@ -727,7 +727,7 @@
         </w:tc>
         <w:tc>
           <w:tcPr>
-            <w:tcW w:type="dxa" w:w="3400"/>
+            <w:tcW w:type="dxa" w:w="3300"/>
             <w:tcMar>
               <w:top w:w="80" w:type="dxa"/>
               <w:start w:w="120" w:type="dxa"/>
@@ -755,7 +755,7 @@
         </w:tc>
         <w:tc>
           <w:tcPr>
-            <w:tcW w:type="dxa" w:w="3660"/>
+            <w:tcW w:type="dxa" w:w="3760"/>
             <w:tcMar>
               <w:top w:w="80" w:type="dxa"/>
               <w:start w:w="120" w:type="dxa"/>
@@ -814,7 +814,7 @@
         </w:tc>
         <w:tc>
           <w:tcPr>
-            <w:tcW w:type="dxa" w:w="3400"/>
+            <w:tcW w:type="dxa" w:w="3300"/>
             <w:tcMar>
               <w:top w:w="80" w:type="dxa"/>
               <w:start w:w="120" w:type="dxa"/>
@@ -841,7 +841,7 @@
         </w:tc>
         <w:tc>
           <w:tcPr>
-            <w:tcW w:type="dxa" w:w="3660"/>
+            <w:tcW w:type="dxa" w:w="3760"/>
             <w:tcMar>
               <w:top w:w="80" w:type="dxa"/>
               <w:start w:w="120" w:type="dxa"/>
@@ -900,7 +900,7 @@
         </w:tc>
         <w:tc>
           <w:tcPr>
-            <w:tcW w:type="dxa" w:w="3400"/>
+            <w:tcW w:type="dxa" w:w="3300"/>
             <w:tcMar>
               <w:top w:w="80" w:type="dxa"/>
               <w:start w:w="120" w:type="dxa"/>
@@ -928,7 +928,7 @@
         </w:tc>
         <w:tc>
           <w:tcPr>
-            <w:tcW w:type="dxa" w:w="3660"/>
+            <w:tcW w:type="dxa" w:w="3760"/>
             <w:tcMar>
               <w:top w:w="80" w:type="dxa"/>
               <w:start w:w="120" w:type="dxa"/>
@@ -987,7 +987,7 @@
         </w:tc>
         <w:tc>
           <w:tcPr>
-            <w:tcW w:type="dxa" w:w="3400"/>
+            <w:tcW w:type="dxa" w:w="3300"/>
             <w:tcMar>
               <w:top w:w="80" w:type="dxa"/>
               <w:start w:w="120" w:type="dxa"/>
@@ -1014,7 +1014,7 @@
         </w:tc>
         <w:tc>
           <w:tcPr>
-            <w:tcW w:type="dxa" w:w="3660"/>
+            <w:tcW w:type="dxa" w:w="3760"/>
             <w:tcMar>
               <w:top w:w="80" w:type="dxa"/>
               <w:start w:w="120" w:type="dxa"/>
@@ -1073,7 +1073,7 @@
         </w:tc>
         <w:tc>
           <w:tcPr>
-            <w:tcW w:type="dxa" w:w="3400"/>
+            <w:tcW w:type="dxa" w:w="3300"/>
             <w:tcMar>
               <w:top w:w="80" w:type="dxa"/>
               <w:start w:w="120" w:type="dxa"/>
@@ -1101,7 +1101,7 @@
         </w:tc>
         <w:tc>
           <w:tcPr>
-            <w:tcW w:type="dxa" w:w="3660"/>
+            <w:tcW w:type="dxa" w:w="3760"/>
             <w:tcMar>
               <w:top w:w="80" w:type="dxa"/>
               <w:start w:w="120" w:type="dxa"/>
@@ -1124,6 +1124,91 @@
                 <w:sz w:val="16"/>
               </w:rPr>
               <w:t>一致率 79.5%、AI 精确率 95.1%、召回率 66.7%、修订披露率 55.7%</w:t>
+            </w:r>
+          </w:p>
+        </w:tc>
+      </w:tr>
+      <w:tr>
+        <w:trPr>
+          <w:cantSplit/>
+        </w:trPr>
+        <w:tc>
+          <w:tcPr>
+            <w:tcW w:type="dxa" w:w="2300"/>
+            <w:tcMar>
+              <w:top w:w="80" w:type="dxa"/>
+              <w:start w:w="120" w:type="dxa"/>
+              <w:bottom w:w="80" w:type="dxa"/>
+              <w:end w:w="120" w:type="dxa"/>
+            </w:tcMar>
+            <w:vAlign w:val="center"/>
+          </w:tcPr>
+          <w:p>
+            <w:pPr>
+              <w:spacing w:before="0" w:after="0" w:line="252" w:lineRule="auto"/>
+            </w:pPr>
+            <w:r>
+              <w:rPr>
+                <w:rFonts w:ascii="Calibri" w:hAnsi="Calibri" w:eastAsia="Microsoft YaHei"/>
+                <w:b w:val="0"/>
+                <w:color w:val="333333"/>
+                <w:sz w:val="16"/>
+              </w:rPr>
+              <w:t>既然前几轮已达成一致，为何还要往下（提前停止）</w:t>
+            </w:r>
+          </w:p>
+        </w:tc>
+        <w:tc>
+          <w:tcPr>
+            <w:tcW w:type="dxa" w:w="3300"/>
+            <w:tcMar>
+              <w:top w:w="80" w:type="dxa"/>
+              <w:start w:w="120" w:type="dxa"/>
+              <w:bottom w:w="80" w:type="dxa"/>
+              <w:end w:w="120" w:type="dxa"/>
+            </w:tcMar>
+            <w:vAlign w:val="center"/>
+          </w:tcPr>
+          <w:p>
+            <w:pPr>
+              <w:spacing w:before="0" w:after="0" w:line="252" w:lineRule="auto"/>
+              <w:jc w:val="left"/>
+            </w:pPr>
+            <w:r>
+              <w:rPr>
+                <w:rFonts w:ascii="Calibri" w:hAnsi="Calibri" w:eastAsia="Microsoft YaHei"/>
+                <w:b w:val="0"/>
+                <w:color w:val="333333"/>
+                <w:sz w:val="16"/>
+              </w:rPr>
+              <w:t>固定轮转分别截断为 16/32/60 条消息对照</w:t>
+            </w:r>
+          </w:p>
+        </w:tc>
+        <w:tc>
+          <w:tcPr>
+            <w:tcW w:type="dxa" w:w="3760"/>
+            <w:tcMar>
+              <w:top w:w="80" w:type="dxa"/>
+              <w:start w:w="120" w:type="dxa"/>
+              <w:bottom w:w="80" w:type="dxa"/>
+              <w:end w:w="120" w:type="dxa"/>
+            </w:tcMar>
+            <w:vAlign w:val="center"/>
+          </w:tcPr>
+          <w:p>
+            <w:pPr>
+              <w:spacing w:before="0" w:after="0" w:line="252" w:lineRule="auto"/>
+              <w:jc w:val="left"/>
+            </w:pPr>
+            <w:r>
+              <w:rPr>
+                <w:rFonts w:ascii="Calibri" w:hAnsi="Calibri" w:eastAsia="Microsoft YaHei"/>
+                <w:b w:val="0"/>
+                <w:color w:val="333333"/>
+                <w:sz w:val="16"/>
+              </w:rPr>
+              <w:t>三者结果完全相同（各 20/40）：共识形成后继续发言无收益，可提前停止省 token</w:t>
             </w:r>
           </w:p>
         </w:tc>
@@ -3692,7 +3777,7 @@
                 <w:color w:val="333333"/>
                 <w:sz w:val="15"/>
               </w:rPr>
-              <w:t>5 校长候选人</w:t>
+              <w:t>1 撤离路线</w:t>
             </w:r>
           </w:p>
         </w:tc>
@@ -3718,7 +3803,7 @@
                 <w:color w:val="333333"/>
                 <w:sz w:val="15"/>
               </w:rPr>
-              <w:t>固定轮转60条</w:t>
+              <w:t>固定轮转16条（提前停止）</w:t>
             </w:r>
           </w:p>
         </w:tc>
@@ -3744,7 +3829,7 @@
                 <w:color w:val="333333"/>
                 <w:sz w:val="15"/>
               </w:rPr>
-              <w:t>0.0%</w:t>
+              <w:t>87.5%</w:t>
             </w:r>
           </w:p>
         </w:tc>
@@ -3770,13 +3855,39 @@
                 <w:color w:val="333333"/>
                 <w:sz w:val="15"/>
               </w:rPr>
+              <w:t>10/10</w:t>
+            </w:r>
+          </w:p>
+        </w:tc>
+        <w:tc>
+          <w:tcPr>
+            <w:tcW w:type="dxa" w:w="950"/>
+            <w:tcMar>
+              <w:top w:w="80" w:type="dxa"/>
+              <w:start w:w="120" w:type="dxa"/>
+              <w:bottom w:w="80" w:type="dxa"/>
+              <w:end w:w="120" w:type="dxa"/>
+            </w:tcMar>
+            <w:vAlign w:val="center"/>
+          </w:tcPr>
+          <w:p>
+            <w:pPr>
+              <w:spacing w:before="0" w:after="0" w:line="252" w:lineRule="auto"/>
+            </w:pPr>
+            <w:r>
+              <w:rPr>
+                <w:rFonts w:ascii="Calibri" w:hAnsi="Calibri" w:eastAsia="Microsoft YaHei"/>
+                <w:b w:val="0"/>
+                <w:color w:val="333333"/>
+                <w:sz w:val="15"/>
+              </w:rPr>
               <w:t>0/10</w:t>
             </w:r>
           </w:p>
         </w:tc>
         <w:tc>
           <w:tcPr>
-            <w:tcW w:type="dxa" w:w="950"/>
+            <w:tcW w:type="dxa" w:w="1050"/>
             <w:tcMar>
               <w:top w:w="80" w:type="dxa"/>
               <w:start w:w="120" w:type="dxa"/>
@@ -3796,13 +3907,13 @@
                 <w:color w:val="333333"/>
                 <w:sz w:val="15"/>
               </w:rPr>
-              <w:t>10/10</w:t>
-            </w:r>
-          </w:p>
-        </w:tc>
-        <w:tc>
-          <w:tcPr>
-            <w:tcW w:type="dxa" w:w="1050"/>
+              <w:t>100.0%</w:t>
+            </w:r>
+          </w:p>
+        </w:tc>
+        <w:tc>
+          <w:tcPr>
+            <w:tcW w:type="dxa" w:w="2710"/>
             <w:tcMar>
               <w:top w:w="80" w:type="dxa"/>
               <w:start w:w="120" w:type="dxa"/>
@@ -3822,33 +3933,7 @@
                 <w:color w:val="333333"/>
                 <w:sz w:val="15"/>
               </w:rPr>
-              <w:t>0.0%</w:t>
-            </w:r>
-          </w:p>
-        </w:tc>
-        <w:tc>
-          <w:tcPr>
-            <w:tcW w:type="dxa" w:w="2710"/>
-            <w:tcMar>
-              <w:top w:w="80" w:type="dxa"/>
-              <w:start w:w="120" w:type="dxa"/>
-              <w:bottom w:w="80" w:type="dxa"/>
-              <w:end w:w="120" w:type="dxa"/>
-            </w:tcMar>
-            <w:vAlign w:val="center"/>
-          </w:tcPr>
-          <w:p>
-            <w:pPr>
-              <w:spacing w:before="0" w:after="0" w:line="252" w:lineRule="auto"/>
-            </w:pPr>
-            <w:r>
-              <w:rPr>
-                <w:rFonts w:ascii="Calibri" w:hAnsi="Calibri" w:eastAsia="Microsoft YaHei"/>
-                <w:b w:val="0"/>
-                <w:color w:val="333333"/>
-                <w:sz w:val="15"/>
-              </w:rPr>
-              <w:t>95.0%</w:t>
+              <w:t>80.0%</w:t>
             </w:r>
           </w:p>
         </w:tc>
@@ -3880,7 +3965,7 @@
                 <w:color w:val="333333"/>
                 <w:sz w:val="15"/>
               </w:rPr>
-              <w:t>5 校长候选人</w:t>
+              <w:t>1 撤离路线</w:t>
             </w:r>
           </w:p>
         </w:tc>
@@ -3907,7 +3992,7 @@
                 <w:color w:val="333333"/>
                 <w:sz w:val="15"/>
               </w:rPr>
-              <w:t>MAF动态60条</w:t>
+              <w:t>固定轮转32条（提前停止）</w:t>
             </w:r>
           </w:p>
         </w:tc>
@@ -3934,7 +4019,7 @@
                 <w:color w:val="333333"/>
                 <w:sz w:val="15"/>
               </w:rPr>
-              <w:t>0.0%</w:t>
+              <w:t>87.5%</w:t>
             </w:r>
           </w:p>
         </w:tc>
@@ -3961,13 +4046,40 @@
                 <w:color w:val="333333"/>
                 <w:sz w:val="15"/>
               </w:rPr>
+              <w:t>10/10</w:t>
+            </w:r>
+          </w:p>
+        </w:tc>
+        <w:tc>
+          <w:tcPr>
+            <w:tcW w:type="dxa" w:w="950"/>
+            <w:tcMar>
+              <w:top w:w="80" w:type="dxa"/>
+              <w:start w:w="120" w:type="dxa"/>
+              <w:bottom w:w="80" w:type="dxa"/>
+              <w:end w:w="120" w:type="dxa"/>
+            </w:tcMar>
+            <w:vAlign w:val="center"/>
+            <w:shd w:fill="F4F8FC"/>
+          </w:tcPr>
+          <w:p>
+            <w:pPr>
+              <w:spacing w:before="0" w:after="0" w:line="252" w:lineRule="auto"/>
+            </w:pPr>
+            <w:r>
+              <w:rPr>
+                <w:rFonts w:ascii="Calibri" w:hAnsi="Calibri" w:eastAsia="Microsoft YaHei"/>
+                <w:b w:val="0"/>
+                <w:color w:val="333333"/>
+                <w:sz w:val="15"/>
+              </w:rPr>
               <w:t>0/10</w:t>
             </w:r>
           </w:p>
         </w:tc>
         <w:tc>
           <w:tcPr>
-            <w:tcW w:type="dxa" w:w="950"/>
+            <w:tcW w:type="dxa" w:w="1050"/>
             <w:tcMar>
               <w:top w:w="80" w:type="dxa"/>
               <w:start w:w="120" w:type="dxa"/>
@@ -3988,13 +4100,13 @@
                 <w:color w:val="333333"/>
                 <w:sz w:val="15"/>
               </w:rPr>
-              <w:t>10/10</w:t>
-            </w:r>
-          </w:p>
-        </w:tc>
-        <w:tc>
-          <w:tcPr>
-            <w:tcW w:type="dxa" w:w="1050"/>
+              <w:t>100.0%</w:t>
+            </w:r>
+          </w:p>
+        </w:tc>
+        <w:tc>
+          <w:tcPr>
+            <w:tcW w:type="dxa" w:w="2710"/>
             <w:tcMar>
               <w:top w:w="80" w:type="dxa"/>
               <w:start w:w="120" w:type="dxa"/>
@@ -4015,34 +4127,7 @@
                 <w:color w:val="333333"/>
                 <w:sz w:val="15"/>
               </w:rPr>
-              <w:t>0.0%</w:t>
-            </w:r>
-          </w:p>
-        </w:tc>
-        <w:tc>
-          <w:tcPr>
-            <w:tcW w:type="dxa" w:w="2710"/>
-            <w:tcMar>
-              <w:top w:w="80" w:type="dxa"/>
-              <w:start w:w="120" w:type="dxa"/>
-              <w:bottom w:w="80" w:type="dxa"/>
-              <w:end w:w="120" w:type="dxa"/>
-            </w:tcMar>
-            <w:vAlign w:val="center"/>
-            <w:shd w:fill="F4F8FC"/>
-          </w:tcPr>
-          <w:p>
-            <w:pPr>
-              <w:spacing w:before="0" w:after="0" w:line="252" w:lineRule="auto"/>
-            </w:pPr>
-            <w:r>
-              <w:rPr>
-                <w:rFonts w:ascii="Calibri" w:hAnsi="Calibri" w:eastAsia="Microsoft YaHei"/>
-                <w:b w:val="0"/>
-                <w:color w:val="333333"/>
-                <w:sz w:val="15"/>
-              </w:rPr>
-              <w:t>95.0%</w:t>
+              <w:t>82.5%</w:t>
             </w:r>
           </w:p>
         </w:tc>
@@ -4099,7 +4184,7 @@
                 <w:color w:val="333333"/>
                 <w:sz w:val="15"/>
               </w:rPr>
-              <w:t>固定+强制披露</w:t>
+              <w:t>固定轮转60条</w:t>
             </w:r>
           </w:p>
         </w:tc>
@@ -4125,7 +4210,7 @@
                 <w:color w:val="333333"/>
                 <w:sz w:val="15"/>
               </w:rPr>
-              <w:t>40.0%</w:t>
+              <w:t>0.0%</w:t>
             </w:r>
           </w:p>
         </w:tc>
@@ -4151,7 +4236,7 @@
                 <w:color w:val="333333"/>
                 <w:sz w:val="15"/>
               </w:rPr>
-              <w:t>2/10</w:t>
+              <w:t>0/10</w:t>
             </w:r>
           </w:p>
         </w:tc>
@@ -4177,7 +4262,7 @@
                 <w:color w:val="333333"/>
                 <w:sz w:val="15"/>
               </w:rPr>
-              <w:t>8/10</w:t>
+              <w:t>10/10</w:t>
             </w:r>
           </w:p>
         </w:tc>
@@ -4203,7 +4288,7 @@
                 <w:color w:val="333333"/>
                 <w:sz w:val="15"/>
               </w:rPr>
-              <w:t>20.0%</w:t>
+              <w:t>0.0%</w:t>
             </w:r>
           </w:p>
         </w:tc>
@@ -4229,7 +4314,7 @@
                 <w:color w:val="333333"/>
                 <w:sz w:val="15"/>
               </w:rPr>
-              <w:t>85.0%</w:t>
+              <w:t>95.0%</w:t>
             </w:r>
           </w:p>
         </w:tc>
@@ -4288,7 +4373,7 @@
                 <w:color w:val="333333"/>
                 <w:sz w:val="15"/>
               </w:rPr>
-              <w:t>MAF动态+强制披露</w:t>
+              <w:t>MAF动态60条</w:t>
             </w:r>
           </w:p>
         </w:tc>
@@ -4315,7 +4400,7 @@
                 <w:color w:val="333333"/>
                 <w:sz w:val="15"/>
               </w:rPr>
-              <w:t>40.0%</w:t>
+              <w:t>0.0%</w:t>
             </w:r>
           </w:p>
         </w:tc>
@@ -4423,7 +4508,7 @@
                 <w:color w:val="333333"/>
                 <w:sz w:val="15"/>
               </w:rPr>
-              <w:t>87.5%</w:t>
+              <w:t>95.0%</w:t>
             </w:r>
           </w:p>
         </w:tc>
@@ -4480,7 +4565,7 @@
                 <w:color w:val="333333"/>
                 <w:sz w:val="15"/>
               </w:rPr>
-              <w:t>Structured协议12条</w:t>
+              <w:t>固定+强制披露</w:t>
             </w:r>
           </w:p>
         </w:tc>
@@ -4506,7 +4591,7 @@
                 <w:color w:val="333333"/>
                 <w:sz w:val="15"/>
               </w:rPr>
-              <w:t>22.5%</w:t>
+              <w:t>40.0%</w:t>
             </w:r>
           </w:p>
         </w:tc>
@@ -4532,7 +4617,7 @@
                 <w:color w:val="333333"/>
                 <w:sz w:val="15"/>
               </w:rPr>
-              <w:t>0/10</w:t>
+              <w:t>2/10</w:t>
             </w:r>
           </w:p>
         </w:tc>
@@ -4558,7 +4643,7 @@
                 <w:color w:val="333333"/>
                 <w:sz w:val="15"/>
               </w:rPr>
-              <w:t>10/10</w:t>
+              <w:t>8/10</w:t>
             </w:r>
           </w:p>
         </w:tc>
@@ -4584,7 +4669,7 @@
                 <w:color w:val="333333"/>
                 <w:sz w:val="15"/>
               </w:rPr>
-              <w:t>0.0%</w:t>
+              <w:t>20.0%</w:t>
             </w:r>
           </w:p>
         </w:tc>
@@ -4610,7 +4695,7 @@
                 <w:color w:val="333333"/>
                 <w:sz w:val="15"/>
               </w:rPr>
-              <w:t>90.0%</w:t>
+              <w:t>85.0%</w:t>
             </w:r>
           </w:p>
         </w:tc>
@@ -4669,7 +4754,7 @@
                 <w:color w:val="333333"/>
                 <w:sz w:val="15"/>
               </w:rPr>
-              <w:t>固定轮转12条</w:t>
+              <w:t>MAF动态+强制披露</w:t>
             </w:r>
           </w:p>
         </w:tc>
@@ -4696,7 +4781,7 @@
                 <w:color w:val="333333"/>
                 <w:sz w:val="15"/>
               </w:rPr>
-              <w:t>—</w:t>
+              <w:t>40.0%</w:t>
             </w:r>
           </w:p>
         </w:tc>
@@ -4750,7 +4835,7 @@
                 <w:color w:val="333333"/>
                 <w:sz w:val="15"/>
               </w:rPr>
-              <w:t>9/10</w:t>
+              <w:t>10/10</w:t>
             </w:r>
           </w:p>
         </w:tc>
@@ -4804,7 +4889,7 @@
                 <w:color w:val="333333"/>
                 <w:sz w:val="15"/>
               </w:rPr>
-              <w:t>90.0%</w:t>
+              <w:t>87.5%</w:t>
             </w:r>
           </w:p>
         </w:tc>
@@ -4861,7 +4946,7 @@
                 <w:color w:val="333333"/>
                 <w:sz w:val="15"/>
               </w:rPr>
-              <w:t>单智能体直接作答</w:t>
+              <w:t>Structured协议12条</w:t>
             </w:r>
           </w:p>
         </w:tc>
@@ -4887,7 +4972,7 @@
                 <w:color w:val="333333"/>
                 <w:sz w:val="15"/>
               </w:rPr>
-              <w:t>—</w:t>
+              <w:t>22.5%</w:t>
             </w:r>
           </w:p>
         </w:tc>
@@ -4991,7 +5076,7 @@
                 <w:color w:val="333333"/>
                 <w:sz w:val="15"/>
               </w:rPr>
-              <w:t>80.0%</w:t>
+              <w:t>90.0%</w:t>
             </w:r>
           </w:p>
         </w:tc>
@@ -5050,7 +5135,7 @@
                 <w:color w:val="333333"/>
                 <w:sz w:val="15"/>
               </w:rPr>
-              <w:t>单智能体+15轮反思</w:t>
+              <w:t>固定轮转12条</w:t>
             </w:r>
           </w:p>
         </w:tc>
@@ -5104,7 +5189,7 @@
                 <w:color w:val="333333"/>
                 <w:sz w:val="15"/>
               </w:rPr>
-              <w:t>1/10</w:t>
+              <w:t>0/10</w:t>
             </w:r>
           </w:p>
         </w:tc>
@@ -5158,7 +5243,7 @@
                 <w:color w:val="333333"/>
                 <w:sz w:val="15"/>
               </w:rPr>
-              <w:t>10.0%</w:t>
+              <w:t>0.0%</w:t>
             </w:r>
           </w:p>
         </w:tc>
@@ -5185,7 +5270,7 @@
                 <w:color w:val="333333"/>
                 <w:sz w:val="15"/>
               </w:rPr>
-              <w:t>70.0%</w:t>
+              <w:t>90.0%</w:t>
             </w:r>
           </w:p>
         </w:tc>
@@ -5216,7 +5301,7 @@
                 <w:color w:val="333333"/>
                 <w:sz w:val="15"/>
               </w:rPr>
-              <w:t>7 供应商选择</w:t>
+              <w:t>5 校长候选人</w:t>
             </w:r>
           </w:p>
         </w:tc>
@@ -5242,7 +5327,7 @@
                 <w:color w:val="333333"/>
                 <w:sz w:val="15"/>
               </w:rPr>
-              <w:t>固定轮转60条</w:t>
+              <w:t>单智能体直接作答</w:t>
             </w:r>
           </w:p>
         </w:tc>
@@ -5268,13 +5353,91 @@
                 <w:color w:val="333333"/>
                 <w:sz w:val="15"/>
               </w:rPr>
+              <w:t>—</w:t>
+            </w:r>
+          </w:p>
+        </w:tc>
+        <w:tc>
+          <w:tcPr>
+            <w:tcW w:type="dxa" w:w="850"/>
+            <w:tcMar>
+              <w:top w:w="80" w:type="dxa"/>
+              <w:start w:w="120" w:type="dxa"/>
+              <w:bottom w:w="80" w:type="dxa"/>
+              <w:end w:w="120" w:type="dxa"/>
+            </w:tcMar>
+            <w:vAlign w:val="center"/>
+          </w:tcPr>
+          <w:p>
+            <w:pPr>
+              <w:spacing w:before="0" w:after="0" w:line="252" w:lineRule="auto"/>
+            </w:pPr>
+            <w:r>
+              <w:rPr>
+                <w:rFonts w:ascii="Calibri" w:hAnsi="Calibri" w:eastAsia="Microsoft YaHei"/>
+                <w:b w:val="0"/>
+                <w:color w:val="333333"/>
+                <w:sz w:val="15"/>
+              </w:rPr>
+              <w:t>0/10</w:t>
+            </w:r>
+          </w:p>
+        </w:tc>
+        <w:tc>
+          <w:tcPr>
+            <w:tcW w:type="dxa" w:w="950"/>
+            <w:tcMar>
+              <w:top w:w="80" w:type="dxa"/>
+              <w:start w:w="120" w:type="dxa"/>
+              <w:bottom w:w="80" w:type="dxa"/>
+              <w:end w:w="120" w:type="dxa"/>
+            </w:tcMar>
+            <w:vAlign w:val="center"/>
+          </w:tcPr>
+          <w:p>
+            <w:pPr>
+              <w:spacing w:before="0" w:after="0" w:line="252" w:lineRule="auto"/>
+            </w:pPr>
+            <w:r>
+              <w:rPr>
+                <w:rFonts w:ascii="Calibri" w:hAnsi="Calibri" w:eastAsia="Microsoft YaHei"/>
+                <w:b w:val="0"/>
+                <w:color w:val="333333"/>
+                <w:sz w:val="15"/>
+              </w:rPr>
+              <w:t>10/10</w:t>
+            </w:r>
+          </w:p>
+        </w:tc>
+        <w:tc>
+          <w:tcPr>
+            <w:tcW w:type="dxa" w:w="1050"/>
+            <w:tcMar>
+              <w:top w:w="80" w:type="dxa"/>
+              <w:start w:w="120" w:type="dxa"/>
+              <w:bottom w:w="80" w:type="dxa"/>
+              <w:end w:w="120" w:type="dxa"/>
+            </w:tcMar>
+            <w:vAlign w:val="center"/>
+          </w:tcPr>
+          <w:p>
+            <w:pPr>
+              <w:spacing w:before="0" w:after="0" w:line="252" w:lineRule="auto"/>
+            </w:pPr>
+            <w:r>
+              <w:rPr>
+                <w:rFonts w:ascii="Calibri" w:hAnsi="Calibri" w:eastAsia="Microsoft YaHei"/>
+                <w:b w:val="0"/>
+                <w:color w:val="333333"/>
+                <w:sz w:val="15"/>
+              </w:rPr>
               <w:t>0.0%</w:t>
             </w:r>
           </w:p>
         </w:tc>
         <w:tc>
           <w:tcPr>
-            <w:tcW w:type="dxa" w:w="850"/>
+            <w:tcW w:type="dxa" w:w="2710"/>
             <w:tcMar>
               <w:top w:w="80" w:type="dxa"/>
               <w:start w:w="120" w:type="dxa"/>
@@ -5294,85 +5457,7 @@
                 <w:color w:val="333333"/>
                 <w:sz w:val="15"/>
               </w:rPr>
-              <w:t>2/10</w:t>
-            </w:r>
-          </w:p>
-        </w:tc>
-        <w:tc>
-          <w:tcPr>
-            <w:tcW w:type="dxa" w:w="950"/>
-            <w:tcMar>
-              <w:top w:w="80" w:type="dxa"/>
-              <w:start w:w="120" w:type="dxa"/>
-              <w:bottom w:w="80" w:type="dxa"/>
-              <w:end w:w="120" w:type="dxa"/>
-            </w:tcMar>
-            <w:vAlign w:val="center"/>
-          </w:tcPr>
-          <w:p>
-            <w:pPr>
-              <w:spacing w:before="0" w:after="0" w:line="252" w:lineRule="auto"/>
-            </w:pPr>
-            <w:r>
-              <w:rPr>
-                <w:rFonts w:ascii="Calibri" w:hAnsi="Calibri" w:eastAsia="Microsoft YaHei"/>
-                <w:b w:val="0"/>
-                <w:color w:val="333333"/>
-                <w:sz w:val="15"/>
-              </w:rPr>
-              <w:t>8/10</w:t>
-            </w:r>
-          </w:p>
-        </w:tc>
-        <w:tc>
-          <w:tcPr>
-            <w:tcW w:type="dxa" w:w="1050"/>
-            <w:tcMar>
-              <w:top w:w="80" w:type="dxa"/>
-              <w:start w:w="120" w:type="dxa"/>
-              <w:bottom w:w="80" w:type="dxa"/>
-              <w:end w:w="120" w:type="dxa"/>
-            </w:tcMar>
-            <w:vAlign w:val="center"/>
-          </w:tcPr>
-          <w:p>
-            <w:pPr>
-              <w:spacing w:before="0" w:after="0" w:line="252" w:lineRule="auto"/>
-            </w:pPr>
-            <w:r>
-              <w:rPr>
-                <w:rFonts w:ascii="Calibri" w:hAnsi="Calibri" w:eastAsia="Microsoft YaHei"/>
-                <w:b w:val="0"/>
-                <w:color w:val="333333"/>
-                <w:sz w:val="15"/>
-              </w:rPr>
-              <w:t>20.0%</w:t>
-            </w:r>
-          </w:p>
-        </w:tc>
-        <w:tc>
-          <w:tcPr>
-            <w:tcW w:type="dxa" w:w="2710"/>
-            <w:tcMar>
-              <w:top w:w="80" w:type="dxa"/>
-              <w:start w:w="120" w:type="dxa"/>
-              <w:bottom w:w="80" w:type="dxa"/>
-              <w:end w:w="120" w:type="dxa"/>
-            </w:tcMar>
-            <w:vAlign w:val="center"/>
-          </w:tcPr>
-          <w:p>
-            <w:pPr>
-              <w:spacing w:before="0" w:after="0" w:line="252" w:lineRule="auto"/>
-            </w:pPr>
-            <w:r>
-              <w:rPr>
-                <w:rFonts w:ascii="Calibri" w:hAnsi="Calibri" w:eastAsia="Microsoft YaHei"/>
-                <w:b w:val="0"/>
-                <w:color w:val="333333"/>
-                <w:sz w:val="15"/>
-              </w:rPr>
-              <w:t>87.5%</w:t>
+              <w:t>80.0%</w:t>
             </w:r>
           </w:p>
         </w:tc>
@@ -5404,7 +5489,7 @@
                 <w:color w:val="333333"/>
                 <w:sz w:val="15"/>
               </w:rPr>
-              <w:t>7 供应商选择</w:t>
+              <w:t>5 校长候选人</w:t>
             </w:r>
           </w:p>
         </w:tc>
@@ -5431,7 +5516,7 @@
                 <w:color w:val="333333"/>
                 <w:sz w:val="15"/>
               </w:rPr>
-              <w:t>MAF动态60条</w:t>
+              <w:t>单智能体+15轮反思</w:t>
             </w:r>
           </w:p>
         </w:tc>
@@ -5458,7 +5543,7 @@
                 <w:color w:val="333333"/>
                 <w:sz w:val="15"/>
               </w:rPr>
-              <w:t>0.0%</w:t>
+              <w:t>—</w:t>
             </w:r>
           </w:p>
         </w:tc>
@@ -5485,7 +5570,7 @@
                 <w:color w:val="333333"/>
                 <w:sz w:val="15"/>
               </w:rPr>
-              <w:t>0/10</w:t>
+              <w:t>1/10</w:t>
             </w:r>
           </w:p>
         </w:tc>
@@ -5539,7 +5624,7 @@
                 <w:color w:val="333333"/>
                 <w:sz w:val="15"/>
               </w:rPr>
-              <w:t>0.0%</w:t>
+              <w:t>10.0%</w:t>
             </w:r>
           </w:p>
         </w:tc>
@@ -5566,7 +5651,7 @@
                 <w:color w:val="333333"/>
                 <w:sz w:val="15"/>
               </w:rPr>
-              <w:t>90.0%</w:t>
+              <w:t>70.0%</w:t>
             </w:r>
           </w:p>
         </w:tc>
@@ -5597,7 +5682,7 @@
                 <w:color w:val="333333"/>
                 <w:sz w:val="15"/>
               </w:rPr>
-              <w:t>7 供应商选择</w:t>
+              <w:t>5 校长候选人</w:t>
             </w:r>
           </w:p>
         </w:tc>
@@ -5623,7 +5708,7 @@
                 <w:color w:val="333333"/>
                 <w:sz w:val="15"/>
               </w:rPr>
-              <w:t>固定+强制披露</w:t>
+              <w:t>固定轮转16条（提前停止）</w:t>
             </w:r>
           </w:p>
         </w:tc>
@@ -5649,7 +5734,7 @@
                 <w:color w:val="333333"/>
                 <w:sz w:val="15"/>
               </w:rPr>
-              <w:t>100.0%</w:t>
+              <w:t>0.0%</w:t>
             </w:r>
           </w:p>
         </w:tc>
@@ -5675,7 +5760,7 @@
                 <w:color w:val="333333"/>
                 <w:sz w:val="15"/>
               </w:rPr>
-              <w:t>2/10</w:t>
+              <w:t>0/10</w:t>
             </w:r>
           </w:p>
         </w:tc>
@@ -5701,7 +5786,7 @@
                 <w:color w:val="333333"/>
                 <w:sz w:val="15"/>
               </w:rPr>
-              <w:t>8/10</w:t>
+              <w:t>10/10</w:t>
             </w:r>
           </w:p>
         </w:tc>
@@ -5727,7 +5812,7 @@
                 <w:color w:val="333333"/>
                 <w:sz w:val="15"/>
               </w:rPr>
-              <w:t>20.0%</w:t>
+              <w:t>0.0%</w:t>
             </w:r>
           </w:p>
         </w:tc>
@@ -5785,7 +5870,7 @@
                 <w:color w:val="333333"/>
                 <w:sz w:val="15"/>
               </w:rPr>
-              <w:t>7 供应商选择</w:t>
+              <w:t>5 校长候选人</w:t>
             </w:r>
           </w:p>
         </w:tc>
@@ -5812,7 +5897,7 @@
                 <w:color w:val="333333"/>
                 <w:sz w:val="15"/>
               </w:rPr>
-              <w:t>MAF动态+强制披露</w:t>
+              <w:t>固定轮转32条（提前停止）</w:t>
             </w:r>
           </w:p>
         </w:tc>
@@ -5839,7 +5924,7 @@
                 <w:color w:val="333333"/>
                 <w:sz w:val="15"/>
               </w:rPr>
-              <w:t>100.0%</w:t>
+              <w:t>0.0%</w:t>
             </w:r>
           </w:p>
         </w:tc>
@@ -5866,7 +5951,7 @@
                 <w:color w:val="333333"/>
                 <w:sz w:val="15"/>
               </w:rPr>
-              <w:t>1/10</w:t>
+              <w:t>0/10</w:t>
             </w:r>
           </w:p>
         </w:tc>
@@ -5893,7 +5978,7 @@
                 <w:color w:val="333333"/>
                 <w:sz w:val="15"/>
               </w:rPr>
-              <w:t>9/10</w:t>
+              <w:t>10/10</w:t>
             </w:r>
           </w:p>
         </w:tc>
@@ -5920,7 +6005,7 @@
                 <w:color w:val="333333"/>
                 <w:sz w:val="15"/>
               </w:rPr>
-              <w:t>10.0%</w:t>
+              <w:t>0.0%</w:t>
             </w:r>
           </w:p>
         </w:tc>
@@ -5947,7 +6032,7 @@
                 <w:color w:val="333333"/>
                 <w:sz w:val="15"/>
               </w:rPr>
-              <w:t>87.5%</w:t>
+              <w:t>85.0%</w:t>
             </w:r>
           </w:p>
         </w:tc>
@@ -6004,7 +6089,7 @@
                 <w:color w:val="333333"/>
                 <w:sz w:val="15"/>
               </w:rPr>
-              <w:t>Structured协议12条</w:t>
+              <w:t>固定轮转60条</w:t>
             </w:r>
           </w:p>
         </w:tc>
@@ -6030,7 +6115,7 @@
                 <w:color w:val="333333"/>
                 <w:sz w:val="15"/>
               </w:rPr>
-              <w:t>40.0%</w:t>
+              <w:t>0.0%</w:t>
             </w:r>
           </w:p>
         </w:tc>
@@ -6193,7 +6278,7 @@
                 <w:color w:val="333333"/>
                 <w:sz w:val="15"/>
               </w:rPr>
-              <w:t>固定轮转12条</w:t>
+              <w:t>MAF动态60条</w:t>
             </w:r>
           </w:p>
         </w:tc>
@@ -6220,7 +6305,7 @@
                 <w:color w:val="333333"/>
                 <w:sz w:val="15"/>
               </w:rPr>
-              <w:t>—</w:t>
+              <w:t>0.0%</w:t>
             </w:r>
           </w:p>
         </w:tc>
@@ -6247,7 +6332,7 @@
                 <w:color w:val="333333"/>
                 <w:sz w:val="15"/>
               </w:rPr>
-              <w:t>2/10</w:t>
+              <w:t>0/10</w:t>
             </w:r>
           </w:p>
         </w:tc>
@@ -6274,7 +6359,7 @@
                 <w:color w:val="333333"/>
                 <w:sz w:val="15"/>
               </w:rPr>
-              <w:t>8/10</w:t>
+              <w:t>9/10</w:t>
             </w:r>
           </w:p>
         </w:tc>
@@ -6301,7 +6386,7 @@
                 <w:color w:val="333333"/>
                 <w:sz w:val="15"/>
               </w:rPr>
-              <w:t>20.0%</w:t>
+              <w:t>0.0%</w:t>
             </w:r>
           </w:p>
         </w:tc>
@@ -6328,7 +6413,7 @@
                 <w:color w:val="333333"/>
                 <w:sz w:val="15"/>
               </w:rPr>
-              <w:t>87.5%</w:t>
+              <w:t>90.0%</w:t>
             </w:r>
           </w:p>
         </w:tc>
@@ -6385,7 +6470,7 @@
                 <w:color w:val="333333"/>
                 <w:sz w:val="15"/>
               </w:rPr>
-              <w:t>单智能体直接作答</w:t>
+              <w:t>固定+强制披露</w:t>
             </w:r>
           </w:p>
         </w:tc>
@@ -6411,7 +6496,7 @@
                 <w:color w:val="333333"/>
                 <w:sz w:val="15"/>
               </w:rPr>
-              <w:t>—</w:t>
+              <w:t>100.0%</w:t>
             </w:r>
           </w:p>
         </w:tc>
@@ -6437,7 +6522,7 @@
                 <w:color w:val="333333"/>
                 <w:sz w:val="15"/>
               </w:rPr>
-              <w:t>1/10</w:t>
+              <w:t>2/10</w:t>
             </w:r>
           </w:p>
         </w:tc>
@@ -6463,7 +6548,7 @@
                 <w:color w:val="333333"/>
                 <w:sz w:val="15"/>
               </w:rPr>
-              <w:t>9/10</w:t>
+              <w:t>8/10</w:t>
             </w:r>
           </w:p>
         </w:tc>
@@ -6489,7 +6574,7 @@
                 <w:color w:val="333333"/>
                 <w:sz w:val="15"/>
               </w:rPr>
-              <w:t>10.0%</w:t>
+              <w:t>20.0%</w:t>
             </w:r>
           </w:p>
         </w:tc>
@@ -6515,7 +6600,7 @@
                 <w:color w:val="333333"/>
                 <w:sz w:val="15"/>
               </w:rPr>
-              <w:t>90.0%</w:t>
+              <w:t>87.5%</w:t>
             </w:r>
           </w:p>
         </w:tc>
@@ -6574,7 +6659,7 @@
                 <w:color w:val="333333"/>
                 <w:sz w:val="15"/>
               </w:rPr>
-              <w:t>单智能体+15轮反思</w:t>
+              <w:t>MAF动态+强制披露</w:t>
             </w:r>
           </w:p>
         </w:tc>
@@ -6601,7 +6686,7 @@
                 <w:color w:val="333333"/>
                 <w:sz w:val="15"/>
               </w:rPr>
-              <w:t>—</w:t>
+              <w:t>100.0%</w:t>
             </w:r>
           </w:p>
         </w:tc>
@@ -6628,7 +6713,7 @@
                 <w:color w:val="333333"/>
                 <w:sz w:val="15"/>
               </w:rPr>
-              <w:t>0/10</w:t>
+              <w:t>1/10</w:t>
             </w:r>
           </w:p>
         </w:tc>
@@ -6655,7 +6740,7 @@
                 <w:color w:val="333333"/>
                 <w:sz w:val="15"/>
               </w:rPr>
-              <w:t>10/10</w:t>
+              <w:t>9/10</w:t>
             </w:r>
           </w:p>
         </w:tc>
@@ -6682,7 +6767,7 @@
                 <w:color w:val="333333"/>
                 <w:sz w:val="15"/>
               </w:rPr>
-              <w:t>0.0%</w:t>
+              <w:t>10.0%</w:t>
             </w:r>
           </w:p>
         </w:tc>
@@ -6709,7 +6794,7 @@
                 <w:color w:val="333333"/>
                 <w:sz w:val="15"/>
               </w:rPr>
-              <w:t>90.0%</w:t>
+              <w:t>87.5%</w:t>
             </w:r>
           </w:p>
         </w:tc>
@@ -6740,7 +6825,7 @@
                 <w:color w:val="333333"/>
                 <w:sz w:val="15"/>
               </w:rPr>
-              <w:t>25 应急避难所</w:t>
+              <w:t>7 供应商选择</w:t>
             </w:r>
           </w:p>
         </w:tc>
@@ -6766,7 +6851,7 @@
                 <w:color w:val="333333"/>
                 <w:sz w:val="15"/>
               </w:rPr>
-              <w:t>固定轮转60条</w:t>
+              <w:t>Structured协议12条</w:t>
             </w:r>
           </w:p>
         </w:tc>
@@ -6792,7 +6877,7 @@
                 <w:color w:val="333333"/>
                 <w:sz w:val="15"/>
               </w:rPr>
-              <w:t>67.5%</w:t>
+              <w:t>40.0%</w:t>
             </w:r>
           </w:p>
         </w:tc>
@@ -6818,13 +6903,39 @@
                 <w:color w:val="333333"/>
                 <w:sz w:val="15"/>
               </w:rPr>
+              <w:t>2/10</w:t>
+            </w:r>
+          </w:p>
+        </w:tc>
+        <w:tc>
+          <w:tcPr>
+            <w:tcW w:type="dxa" w:w="950"/>
+            <w:tcMar>
+              <w:top w:w="80" w:type="dxa"/>
+              <w:start w:w="120" w:type="dxa"/>
+              <w:bottom w:w="80" w:type="dxa"/>
+              <w:end w:w="120" w:type="dxa"/>
+            </w:tcMar>
+            <w:vAlign w:val="center"/>
+          </w:tcPr>
+          <w:p>
+            <w:pPr>
+              <w:spacing w:before="0" w:after="0" w:line="252" w:lineRule="auto"/>
+            </w:pPr>
+            <w:r>
+              <w:rPr>
+                <w:rFonts w:ascii="Calibri" w:hAnsi="Calibri" w:eastAsia="Microsoft YaHei"/>
+                <w:b w:val="0"/>
+                <w:color w:val="333333"/>
+                <w:sz w:val="15"/>
+              </w:rPr>
               <w:t>8/10</w:t>
             </w:r>
           </w:p>
         </w:tc>
         <w:tc>
           <w:tcPr>
-            <w:tcW w:type="dxa" w:w="950"/>
+            <w:tcW w:type="dxa" w:w="1050"/>
             <w:tcMar>
               <w:top w:w="80" w:type="dxa"/>
               <w:start w:w="120" w:type="dxa"/>
@@ -6844,13 +6955,13 @@
                 <w:color w:val="333333"/>
                 <w:sz w:val="15"/>
               </w:rPr>
-              <w:t>2/10</w:t>
-            </w:r>
-          </w:p>
-        </w:tc>
-        <w:tc>
-          <w:tcPr>
-            <w:tcW w:type="dxa" w:w="1050"/>
+              <w:t>20.0%</w:t>
+            </w:r>
+          </w:p>
+        </w:tc>
+        <w:tc>
+          <w:tcPr>
+            <w:tcW w:type="dxa" w:w="2710"/>
             <w:tcMar>
               <w:top w:w="80" w:type="dxa"/>
               <w:start w:w="120" w:type="dxa"/>
@@ -6870,33 +6981,7 @@
                 <w:color w:val="333333"/>
                 <w:sz w:val="15"/>
               </w:rPr>
-              <w:t>80.0%</w:t>
-            </w:r>
-          </w:p>
-        </w:tc>
-        <w:tc>
-          <w:tcPr>
-            <w:tcW w:type="dxa" w:w="2710"/>
-            <w:tcMar>
-              <w:top w:w="80" w:type="dxa"/>
-              <w:start w:w="120" w:type="dxa"/>
-              <w:bottom w:w="80" w:type="dxa"/>
-              <w:end w:w="120" w:type="dxa"/>
-            </w:tcMar>
-            <w:vAlign w:val="center"/>
-          </w:tcPr>
-          <w:p>
-            <w:pPr>
-              <w:spacing w:before="0" w:after="0" w:line="252" w:lineRule="auto"/>
-            </w:pPr>
-            <w:r>
-              <w:rPr>
-                <w:rFonts w:ascii="Calibri" w:hAnsi="Calibri" w:eastAsia="Microsoft YaHei"/>
-                <w:b w:val="0"/>
-                <w:color w:val="333333"/>
-                <w:sz w:val="15"/>
-              </w:rPr>
-              <w:t>100.0%</w:t>
+              <w:t>87.5%</w:t>
             </w:r>
           </w:p>
         </w:tc>
@@ -6928,7 +7013,7 @@
                 <w:color w:val="333333"/>
                 <w:sz w:val="15"/>
               </w:rPr>
-              <w:t>25 应急避难所</w:t>
+              <w:t>7 供应商选择</w:t>
             </w:r>
           </w:p>
         </w:tc>
@@ -6955,7 +7040,7 @@
                 <w:color w:val="333333"/>
                 <w:sz w:val="15"/>
               </w:rPr>
-              <w:t>MAF动态60条</w:t>
+              <w:t>固定轮转12条</w:t>
             </w:r>
           </w:p>
         </w:tc>
@@ -6982,7 +7067,7 @@
                 <w:color w:val="333333"/>
                 <w:sz w:val="15"/>
               </w:rPr>
-              <w:t>67.5%</w:t>
+              <w:t>—</w:t>
             </w:r>
           </w:p>
         </w:tc>
@@ -7009,13 +7094,40 @@
                 <w:color w:val="333333"/>
                 <w:sz w:val="15"/>
               </w:rPr>
+              <w:t>2/10</w:t>
+            </w:r>
+          </w:p>
+        </w:tc>
+        <w:tc>
+          <w:tcPr>
+            <w:tcW w:type="dxa" w:w="950"/>
+            <w:tcMar>
+              <w:top w:w="80" w:type="dxa"/>
+              <w:start w:w="120" w:type="dxa"/>
+              <w:bottom w:w="80" w:type="dxa"/>
+              <w:end w:w="120" w:type="dxa"/>
+            </w:tcMar>
+            <w:vAlign w:val="center"/>
+            <w:shd w:fill="F4F8FC"/>
+          </w:tcPr>
+          <w:p>
+            <w:pPr>
+              <w:spacing w:before="0" w:after="0" w:line="252" w:lineRule="auto"/>
+            </w:pPr>
+            <w:r>
+              <w:rPr>
+                <w:rFonts w:ascii="Calibri" w:hAnsi="Calibri" w:eastAsia="Microsoft YaHei"/>
+                <w:b w:val="0"/>
+                <w:color w:val="333333"/>
+                <w:sz w:val="15"/>
+              </w:rPr>
               <w:t>8/10</w:t>
             </w:r>
           </w:p>
         </w:tc>
         <w:tc>
           <w:tcPr>
-            <w:tcW w:type="dxa" w:w="950"/>
+            <w:tcW w:type="dxa" w:w="1050"/>
             <w:tcMar>
               <w:top w:w="80" w:type="dxa"/>
               <w:start w:w="120" w:type="dxa"/>
@@ -7036,13 +7148,13 @@
                 <w:color w:val="333333"/>
                 <w:sz w:val="15"/>
               </w:rPr>
-              <w:t>1/10</w:t>
-            </w:r>
-          </w:p>
-        </w:tc>
-        <w:tc>
-          <w:tcPr>
-            <w:tcW w:type="dxa" w:w="1050"/>
+              <w:t>20.0%</w:t>
+            </w:r>
+          </w:p>
+        </w:tc>
+        <w:tc>
+          <w:tcPr>
+            <w:tcW w:type="dxa" w:w="2710"/>
             <w:tcMar>
               <w:top w:w="80" w:type="dxa"/>
               <w:start w:w="120" w:type="dxa"/>
@@ -7063,34 +7175,7 @@
                 <w:color w:val="333333"/>
                 <w:sz w:val="15"/>
               </w:rPr>
-              <w:t>85.0%</w:t>
-            </w:r>
-          </w:p>
-        </w:tc>
-        <w:tc>
-          <w:tcPr>
-            <w:tcW w:type="dxa" w:w="2710"/>
-            <w:tcMar>
-              <w:top w:w="80" w:type="dxa"/>
-              <w:start w:w="120" w:type="dxa"/>
-              <w:bottom w:w="80" w:type="dxa"/>
-              <w:end w:w="120" w:type="dxa"/>
-            </w:tcMar>
-            <w:vAlign w:val="center"/>
-            <w:shd w:fill="F4F8FC"/>
-          </w:tcPr>
-          <w:p>
-            <w:pPr>
-              <w:spacing w:before="0" w:after="0" w:line="252" w:lineRule="auto"/>
-            </w:pPr>
-            <w:r>
-              <w:rPr>
-                <w:rFonts w:ascii="Calibri" w:hAnsi="Calibri" w:eastAsia="Microsoft YaHei"/>
-                <w:b w:val="0"/>
-                <w:color w:val="333333"/>
-                <w:sz w:val="15"/>
-              </w:rPr>
-              <w:t>100.0%</w:t>
+              <w:t>87.5%</w:t>
             </w:r>
           </w:p>
         </w:tc>
@@ -7121,7 +7206,7 @@
                 <w:color w:val="333333"/>
                 <w:sz w:val="15"/>
               </w:rPr>
-              <w:t>25 应急避难所</w:t>
+              <w:t>7 供应商选择</w:t>
             </w:r>
           </w:p>
         </w:tc>
@@ -7147,7 +7232,7 @@
                 <w:color w:val="333333"/>
                 <w:sz w:val="15"/>
               </w:rPr>
-              <w:t>固定+强制披露</w:t>
+              <w:t>单智能体直接作答</w:t>
             </w:r>
           </w:p>
         </w:tc>
@@ -7173,7 +7258,7 @@
                 <w:color w:val="333333"/>
                 <w:sz w:val="15"/>
               </w:rPr>
-              <w:t>85.0%</w:t>
+              <w:t>—</w:t>
             </w:r>
           </w:p>
         </w:tc>
@@ -7199,7 +7284,7 @@
                 <w:color w:val="333333"/>
                 <w:sz w:val="15"/>
               </w:rPr>
-              <w:t>10/10</w:t>
+              <w:t>1/10</w:t>
             </w:r>
           </w:p>
         </w:tc>
@@ -7225,7 +7310,7 @@
                 <w:color w:val="333333"/>
                 <w:sz w:val="15"/>
               </w:rPr>
-              <w:t>0/10</w:t>
+              <w:t>9/10</w:t>
             </w:r>
           </w:p>
         </w:tc>
@@ -7251,7 +7336,7 @@
                 <w:color w:val="333333"/>
                 <w:sz w:val="15"/>
               </w:rPr>
-              <w:t>100.0%</w:t>
+              <w:t>10.0%</w:t>
             </w:r>
           </w:p>
         </w:tc>
@@ -7277,7 +7362,7 @@
                 <w:color w:val="333333"/>
                 <w:sz w:val="15"/>
               </w:rPr>
-              <w:t>100.0%</w:t>
+              <w:t>90.0%</w:t>
             </w:r>
           </w:p>
         </w:tc>
@@ -7309,7 +7394,7 @@
                 <w:color w:val="333333"/>
                 <w:sz w:val="15"/>
               </w:rPr>
-              <w:t>25 应急避难所</w:t>
+              <w:t>7 供应商选择</w:t>
             </w:r>
           </w:p>
         </w:tc>
@@ -7336,7 +7421,7 @@
                 <w:color w:val="333333"/>
                 <w:sz w:val="15"/>
               </w:rPr>
-              <w:t>MAF动态+强制披露</w:t>
+              <w:t>单智能体+15轮反思</w:t>
             </w:r>
           </w:p>
         </w:tc>
@@ -7363,7 +7448,7 @@
                 <w:color w:val="333333"/>
                 <w:sz w:val="15"/>
               </w:rPr>
-              <w:t>85.0%</w:t>
+              <w:t>—</w:t>
             </w:r>
           </w:p>
         </w:tc>
@@ -7390,13 +7475,40 @@
                 <w:color w:val="333333"/>
                 <w:sz w:val="15"/>
               </w:rPr>
+              <w:t>0/10</w:t>
+            </w:r>
+          </w:p>
+        </w:tc>
+        <w:tc>
+          <w:tcPr>
+            <w:tcW w:type="dxa" w:w="950"/>
+            <w:tcMar>
+              <w:top w:w="80" w:type="dxa"/>
+              <w:start w:w="120" w:type="dxa"/>
+              <w:bottom w:w="80" w:type="dxa"/>
+              <w:end w:w="120" w:type="dxa"/>
+            </w:tcMar>
+            <w:vAlign w:val="center"/>
+            <w:shd w:fill="F4F8FC"/>
+          </w:tcPr>
+          <w:p>
+            <w:pPr>
+              <w:spacing w:before="0" w:after="0" w:line="252" w:lineRule="auto"/>
+            </w:pPr>
+            <w:r>
+              <w:rPr>
+                <w:rFonts w:ascii="Calibri" w:hAnsi="Calibri" w:eastAsia="Microsoft YaHei"/>
+                <w:b w:val="0"/>
+                <w:color w:val="333333"/>
+                <w:sz w:val="15"/>
+              </w:rPr>
               <w:t>10/10</w:t>
             </w:r>
           </w:p>
         </w:tc>
         <w:tc>
           <w:tcPr>
-            <w:tcW w:type="dxa" w:w="950"/>
+            <w:tcW w:type="dxa" w:w="1050"/>
             <w:tcMar>
               <w:top w:w="80" w:type="dxa"/>
               <w:start w:w="120" w:type="dxa"/>
@@ -7417,13 +7529,13 @@
                 <w:color w:val="333333"/>
                 <w:sz w:val="15"/>
               </w:rPr>
-              <w:t>0/10</w:t>
-            </w:r>
-          </w:p>
-        </w:tc>
-        <w:tc>
-          <w:tcPr>
-            <w:tcW w:type="dxa" w:w="1050"/>
+              <w:t>0.0%</w:t>
+            </w:r>
+          </w:p>
+        </w:tc>
+        <w:tc>
+          <w:tcPr>
+            <w:tcW w:type="dxa" w:w="2710"/>
             <w:tcMar>
               <w:top w:w="80" w:type="dxa"/>
               <w:start w:w="120" w:type="dxa"/>
@@ -7444,34 +7556,7 @@
                 <w:color w:val="333333"/>
                 <w:sz w:val="15"/>
               </w:rPr>
-              <w:t>100.0%</w:t>
-            </w:r>
-          </w:p>
-        </w:tc>
-        <w:tc>
-          <w:tcPr>
-            <w:tcW w:type="dxa" w:w="2710"/>
-            <w:tcMar>
-              <w:top w:w="80" w:type="dxa"/>
-              <w:start w:w="120" w:type="dxa"/>
-              <w:bottom w:w="80" w:type="dxa"/>
-              <w:end w:w="120" w:type="dxa"/>
-            </w:tcMar>
-            <w:vAlign w:val="center"/>
-            <w:shd w:fill="F4F8FC"/>
-          </w:tcPr>
-          <w:p>
-            <w:pPr>
-              <w:spacing w:before="0" w:after="0" w:line="252" w:lineRule="auto"/>
-            </w:pPr>
-            <w:r>
-              <w:rPr>
-                <w:rFonts w:ascii="Calibri" w:hAnsi="Calibri" w:eastAsia="Microsoft YaHei"/>
-                <w:b w:val="0"/>
-                <w:color w:val="333333"/>
-                <w:sz w:val="15"/>
-              </w:rPr>
-              <w:t>100.0%</w:t>
+              <w:t>90.0%</w:t>
             </w:r>
           </w:p>
         </w:tc>
@@ -7502,7 +7587,7 @@
                 <w:color w:val="333333"/>
                 <w:sz w:val="15"/>
               </w:rPr>
-              <w:t>25 应急避难所</w:t>
+              <w:t>7 供应商选择</w:t>
             </w:r>
           </w:p>
         </w:tc>
@@ -7528,7 +7613,7 @@
                 <w:color w:val="333333"/>
                 <w:sz w:val="15"/>
               </w:rPr>
-              <w:t>Structured协议12条</w:t>
+              <w:t>固定轮转16条（提前停止）</w:t>
             </w:r>
           </w:p>
         </w:tc>
@@ -7554,7 +7639,7 @@
                 <w:color w:val="333333"/>
                 <w:sz w:val="15"/>
               </w:rPr>
-              <w:t>67.5%</w:t>
+              <w:t>0.0%</w:t>
             </w:r>
           </w:p>
         </w:tc>
@@ -7580,13 +7665,39 @@
                 <w:color w:val="333333"/>
                 <w:sz w:val="15"/>
               </w:rPr>
+              <w:t>1/10</w:t>
+            </w:r>
+          </w:p>
+        </w:tc>
+        <w:tc>
+          <w:tcPr>
+            <w:tcW w:type="dxa" w:w="950"/>
+            <w:tcMar>
+              <w:top w:w="80" w:type="dxa"/>
+              <w:start w:w="120" w:type="dxa"/>
+              <w:bottom w:w="80" w:type="dxa"/>
+              <w:end w:w="120" w:type="dxa"/>
+            </w:tcMar>
+            <w:vAlign w:val="center"/>
+          </w:tcPr>
+          <w:p>
+            <w:pPr>
+              <w:spacing w:before="0" w:after="0" w:line="252" w:lineRule="auto"/>
+            </w:pPr>
+            <w:r>
+              <w:rPr>
+                <w:rFonts w:ascii="Calibri" w:hAnsi="Calibri" w:eastAsia="Microsoft YaHei"/>
+                <w:b w:val="0"/>
+                <w:color w:val="333333"/>
+                <w:sz w:val="15"/>
+              </w:rPr>
               <w:t>9/10</w:t>
             </w:r>
           </w:p>
         </w:tc>
         <w:tc>
           <w:tcPr>
-            <w:tcW w:type="dxa" w:w="950"/>
+            <w:tcW w:type="dxa" w:w="1050"/>
             <w:tcMar>
               <w:top w:w="80" w:type="dxa"/>
               <w:start w:w="120" w:type="dxa"/>
@@ -7606,13 +7717,13 @@
                 <w:color w:val="333333"/>
                 <w:sz w:val="15"/>
               </w:rPr>
-              <w:t>1/10</w:t>
-            </w:r>
-          </w:p>
-        </w:tc>
-        <w:tc>
-          <w:tcPr>
-            <w:tcW w:type="dxa" w:w="1050"/>
+              <w:t>10.0%</w:t>
+            </w:r>
+          </w:p>
+        </w:tc>
+        <w:tc>
+          <w:tcPr>
+            <w:tcW w:type="dxa" w:w="2710"/>
             <w:tcMar>
               <w:top w:w="80" w:type="dxa"/>
               <w:start w:w="120" w:type="dxa"/>
@@ -7632,33 +7743,7 @@
                 <w:color w:val="333333"/>
                 <w:sz w:val="15"/>
               </w:rPr>
-              <w:t>90.0%</w:t>
-            </w:r>
-          </w:p>
-        </w:tc>
-        <w:tc>
-          <w:tcPr>
-            <w:tcW w:type="dxa" w:w="2710"/>
-            <w:tcMar>
-              <w:top w:w="80" w:type="dxa"/>
-              <w:start w:w="120" w:type="dxa"/>
-              <w:bottom w:w="80" w:type="dxa"/>
-              <w:end w:w="120" w:type="dxa"/>
-            </w:tcMar>
-            <w:vAlign w:val="center"/>
-          </w:tcPr>
-          <w:p>
-            <w:pPr>
-              <w:spacing w:before="0" w:after="0" w:line="252" w:lineRule="auto"/>
-            </w:pPr>
-            <w:r>
-              <w:rPr>
-                <w:rFonts w:ascii="Calibri" w:hAnsi="Calibri" w:eastAsia="Microsoft YaHei"/>
-                <w:b w:val="0"/>
-                <w:color w:val="333333"/>
-                <w:sz w:val="15"/>
-              </w:rPr>
-              <w:t>100.0%</w:t>
+              <w:t>87.5%</w:t>
             </w:r>
           </w:p>
         </w:tc>
@@ -7690,7 +7775,7 @@
                 <w:color w:val="333333"/>
                 <w:sz w:val="15"/>
               </w:rPr>
-              <w:t>25 应急避难所</w:t>
+              <w:t>7 供应商选择</w:t>
             </w:r>
           </w:p>
         </w:tc>
@@ -7717,7 +7802,7 @@
                 <w:color w:val="333333"/>
                 <w:sz w:val="15"/>
               </w:rPr>
-              <w:t>固定轮转12条</w:t>
+              <w:t>固定轮转32条（提前停止）</w:t>
             </w:r>
           </w:p>
         </w:tc>
@@ -7744,7 +7829,7 @@
                 <w:color w:val="333333"/>
                 <w:sz w:val="15"/>
               </w:rPr>
-              <w:t>—</w:t>
+              <w:t>0.0%</w:t>
             </w:r>
           </w:p>
         </w:tc>
@@ -7771,7 +7856,7 @@
                 <w:color w:val="333333"/>
                 <w:sz w:val="15"/>
               </w:rPr>
-              <w:t>9/10</w:t>
+              <w:t>2/10</w:t>
             </w:r>
           </w:p>
         </w:tc>
@@ -7798,7 +7883,7 @@
                 <w:color w:val="333333"/>
                 <w:sz w:val="15"/>
               </w:rPr>
-              <w:t>1/10</w:t>
+              <w:t>8/10</w:t>
             </w:r>
           </w:p>
         </w:tc>
@@ -7825,7 +7910,7 @@
                 <w:color w:val="333333"/>
                 <w:sz w:val="15"/>
               </w:rPr>
-              <w:t>90.0%</w:t>
+              <w:t>20.0%</w:t>
             </w:r>
           </w:p>
         </w:tc>
@@ -7852,7 +7937,7 @@
                 <w:color w:val="333333"/>
                 <w:sz w:val="15"/>
               </w:rPr>
-              <w:t>100.0%</w:t>
+              <w:t>87.5%</w:t>
             </w:r>
           </w:p>
         </w:tc>
@@ -7909,7 +7994,7 @@
                 <w:color w:val="333333"/>
                 <w:sz w:val="15"/>
               </w:rPr>
-              <w:t>单智能体直接作答</w:t>
+              <w:t>固定轮转60条</w:t>
             </w:r>
           </w:p>
         </w:tc>
@@ -7935,7 +8020,7 @@
                 <w:color w:val="333333"/>
                 <w:sz w:val="15"/>
               </w:rPr>
-              <w:t>—</w:t>
+              <w:t>67.5%</w:t>
             </w:r>
           </w:p>
         </w:tc>
@@ -7961,7 +8046,7 @@
                 <w:color w:val="333333"/>
                 <w:sz w:val="15"/>
               </w:rPr>
-              <w:t>4/10</w:t>
+              <w:t>8/10</w:t>
             </w:r>
           </w:p>
         </w:tc>
@@ -7987,7 +8072,7 @@
                 <w:color w:val="333333"/>
                 <w:sz w:val="15"/>
               </w:rPr>
-              <w:t>6/10</w:t>
+              <w:t>2/10</w:t>
             </w:r>
           </w:p>
         </w:tc>
@@ -8013,7 +8098,7 @@
                 <w:color w:val="333333"/>
                 <w:sz w:val="15"/>
               </w:rPr>
-              <w:t>40.0%</w:t>
+              <w:t>80.0%</w:t>
             </w:r>
           </w:p>
         </w:tc>
@@ -8098,6 +8183,1149 @@
                 <w:color w:val="333333"/>
                 <w:sz w:val="15"/>
               </w:rPr>
+              <w:t>MAF动态60条</w:t>
+            </w:r>
+          </w:p>
+        </w:tc>
+        <w:tc>
+          <w:tcPr>
+            <w:tcW w:type="dxa" w:w="1000"/>
+            <w:tcMar>
+              <w:top w:w="80" w:type="dxa"/>
+              <w:start w:w="120" w:type="dxa"/>
+              <w:bottom w:w="80" w:type="dxa"/>
+              <w:end w:w="120" w:type="dxa"/>
+            </w:tcMar>
+            <w:vAlign w:val="center"/>
+            <w:shd w:fill="F4F8FC"/>
+          </w:tcPr>
+          <w:p>
+            <w:pPr>
+              <w:spacing w:before="0" w:after="0" w:line="252" w:lineRule="auto"/>
+            </w:pPr>
+            <w:r>
+              <w:rPr>
+                <w:rFonts w:ascii="Calibri" w:hAnsi="Calibri" w:eastAsia="Microsoft YaHei"/>
+                <w:b w:val="0"/>
+                <w:color w:val="333333"/>
+                <w:sz w:val="15"/>
+              </w:rPr>
+              <w:t>67.5%</w:t>
+            </w:r>
+          </w:p>
+        </w:tc>
+        <w:tc>
+          <w:tcPr>
+            <w:tcW w:type="dxa" w:w="850"/>
+            <w:tcMar>
+              <w:top w:w="80" w:type="dxa"/>
+              <w:start w:w="120" w:type="dxa"/>
+              <w:bottom w:w="80" w:type="dxa"/>
+              <w:end w:w="120" w:type="dxa"/>
+            </w:tcMar>
+            <w:vAlign w:val="center"/>
+            <w:shd w:fill="F4F8FC"/>
+          </w:tcPr>
+          <w:p>
+            <w:pPr>
+              <w:spacing w:before="0" w:after="0" w:line="252" w:lineRule="auto"/>
+            </w:pPr>
+            <w:r>
+              <w:rPr>
+                <w:rFonts w:ascii="Calibri" w:hAnsi="Calibri" w:eastAsia="Microsoft YaHei"/>
+                <w:b w:val="0"/>
+                <w:color w:val="333333"/>
+                <w:sz w:val="15"/>
+              </w:rPr>
+              <w:t>8/10</w:t>
+            </w:r>
+          </w:p>
+        </w:tc>
+        <w:tc>
+          <w:tcPr>
+            <w:tcW w:type="dxa" w:w="950"/>
+            <w:tcMar>
+              <w:top w:w="80" w:type="dxa"/>
+              <w:start w:w="120" w:type="dxa"/>
+              <w:bottom w:w="80" w:type="dxa"/>
+              <w:end w:w="120" w:type="dxa"/>
+            </w:tcMar>
+            <w:vAlign w:val="center"/>
+            <w:shd w:fill="F4F8FC"/>
+          </w:tcPr>
+          <w:p>
+            <w:pPr>
+              <w:spacing w:before="0" w:after="0" w:line="252" w:lineRule="auto"/>
+            </w:pPr>
+            <w:r>
+              <w:rPr>
+                <w:rFonts w:ascii="Calibri" w:hAnsi="Calibri" w:eastAsia="Microsoft YaHei"/>
+                <w:b w:val="0"/>
+                <w:color w:val="333333"/>
+                <w:sz w:val="15"/>
+              </w:rPr>
+              <w:t>1/10</w:t>
+            </w:r>
+          </w:p>
+        </w:tc>
+        <w:tc>
+          <w:tcPr>
+            <w:tcW w:type="dxa" w:w="1050"/>
+            <w:tcMar>
+              <w:top w:w="80" w:type="dxa"/>
+              <w:start w:w="120" w:type="dxa"/>
+              <w:bottom w:w="80" w:type="dxa"/>
+              <w:end w:w="120" w:type="dxa"/>
+            </w:tcMar>
+            <w:vAlign w:val="center"/>
+            <w:shd w:fill="F4F8FC"/>
+          </w:tcPr>
+          <w:p>
+            <w:pPr>
+              <w:spacing w:before="0" w:after="0" w:line="252" w:lineRule="auto"/>
+            </w:pPr>
+            <w:r>
+              <w:rPr>
+                <w:rFonts w:ascii="Calibri" w:hAnsi="Calibri" w:eastAsia="Microsoft YaHei"/>
+                <w:b w:val="0"/>
+                <w:color w:val="333333"/>
+                <w:sz w:val="15"/>
+              </w:rPr>
+              <w:t>85.0%</w:t>
+            </w:r>
+          </w:p>
+        </w:tc>
+        <w:tc>
+          <w:tcPr>
+            <w:tcW w:type="dxa" w:w="2710"/>
+            <w:tcMar>
+              <w:top w:w="80" w:type="dxa"/>
+              <w:start w:w="120" w:type="dxa"/>
+              <w:bottom w:w="80" w:type="dxa"/>
+              <w:end w:w="120" w:type="dxa"/>
+            </w:tcMar>
+            <w:vAlign w:val="center"/>
+            <w:shd w:fill="F4F8FC"/>
+          </w:tcPr>
+          <w:p>
+            <w:pPr>
+              <w:spacing w:before="0" w:after="0" w:line="252" w:lineRule="auto"/>
+            </w:pPr>
+            <w:r>
+              <w:rPr>
+                <w:rFonts w:ascii="Calibri" w:hAnsi="Calibri" w:eastAsia="Microsoft YaHei"/>
+                <w:b w:val="0"/>
+                <w:color w:val="333333"/>
+                <w:sz w:val="15"/>
+              </w:rPr>
+              <w:t>100.0%</w:t>
+            </w:r>
+          </w:p>
+        </w:tc>
+      </w:tr>
+      <w:tr>
+        <w:trPr>
+          <w:cantSplit/>
+        </w:trPr>
+        <w:tc>
+          <w:tcPr>
+            <w:tcW w:type="dxa" w:w="1150"/>
+            <w:tcMar>
+              <w:top w:w="80" w:type="dxa"/>
+              <w:start w:w="120" w:type="dxa"/>
+              <w:bottom w:w="80" w:type="dxa"/>
+              <w:end w:w="120" w:type="dxa"/>
+            </w:tcMar>
+            <w:vAlign w:val="center"/>
+          </w:tcPr>
+          <w:p>
+            <w:pPr>
+              <w:spacing w:before="0" w:after="0" w:line="252" w:lineRule="auto"/>
+            </w:pPr>
+            <w:r>
+              <w:rPr>
+                <w:rFonts w:ascii="Calibri" w:hAnsi="Calibri" w:eastAsia="Microsoft YaHei"/>
+                <w:b w:val="0"/>
+                <w:color w:val="333333"/>
+                <w:sz w:val="15"/>
+              </w:rPr>
+              <w:t>25 应急避难所</w:t>
+            </w:r>
+          </w:p>
+        </w:tc>
+        <w:tc>
+          <w:tcPr>
+            <w:tcW w:type="dxa" w:w="1650"/>
+            <w:tcMar>
+              <w:top w:w="80" w:type="dxa"/>
+              <w:start w:w="120" w:type="dxa"/>
+              <w:bottom w:w="80" w:type="dxa"/>
+              <w:end w:w="120" w:type="dxa"/>
+            </w:tcMar>
+            <w:vAlign w:val="center"/>
+          </w:tcPr>
+          <w:p>
+            <w:pPr>
+              <w:spacing w:before="0" w:after="0" w:line="252" w:lineRule="auto"/>
+            </w:pPr>
+            <w:r>
+              <w:rPr>
+                <w:rFonts w:ascii="Calibri" w:hAnsi="Calibri" w:eastAsia="Microsoft YaHei"/>
+                <w:b w:val="0"/>
+                <w:color w:val="333333"/>
+                <w:sz w:val="15"/>
+              </w:rPr>
+              <w:t>固定+强制披露</w:t>
+            </w:r>
+          </w:p>
+        </w:tc>
+        <w:tc>
+          <w:tcPr>
+            <w:tcW w:type="dxa" w:w="1000"/>
+            <w:tcMar>
+              <w:top w:w="80" w:type="dxa"/>
+              <w:start w:w="120" w:type="dxa"/>
+              <w:bottom w:w="80" w:type="dxa"/>
+              <w:end w:w="120" w:type="dxa"/>
+            </w:tcMar>
+            <w:vAlign w:val="center"/>
+          </w:tcPr>
+          <w:p>
+            <w:pPr>
+              <w:spacing w:before="0" w:after="0" w:line="252" w:lineRule="auto"/>
+            </w:pPr>
+            <w:r>
+              <w:rPr>
+                <w:rFonts w:ascii="Calibri" w:hAnsi="Calibri" w:eastAsia="Microsoft YaHei"/>
+                <w:b w:val="0"/>
+                <w:color w:val="333333"/>
+                <w:sz w:val="15"/>
+              </w:rPr>
+              <w:t>85.0%</w:t>
+            </w:r>
+          </w:p>
+        </w:tc>
+        <w:tc>
+          <w:tcPr>
+            <w:tcW w:type="dxa" w:w="850"/>
+            <w:tcMar>
+              <w:top w:w="80" w:type="dxa"/>
+              <w:start w:w="120" w:type="dxa"/>
+              <w:bottom w:w="80" w:type="dxa"/>
+              <w:end w:w="120" w:type="dxa"/>
+            </w:tcMar>
+            <w:vAlign w:val="center"/>
+          </w:tcPr>
+          <w:p>
+            <w:pPr>
+              <w:spacing w:before="0" w:after="0" w:line="252" w:lineRule="auto"/>
+            </w:pPr>
+            <w:r>
+              <w:rPr>
+                <w:rFonts w:ascii="Calibri" w:hAnsi="Calibri" w:eastAsia="Microsoft YaHei"/>
+                <w:b w:val="0"/>
+                <w:color w:val="333333"/>
+                <w:sz w:val="15"/>
+              </w:rPr>
+              <w:t>10/10</w:t>
+            </w:r>
+          </w:p>
+        </w:tc>
+        <w:tc>
+          <w:tcPr>
+            <w:tcW w:type="dxa" w:w="950"/>
+            <w:tcMar>
+              <w:top w:w="80" w:type="dxa"/>
+              <w:start w:w="120" w:type="dxa"/>
+              <w:bottom w:w="80" w:type="dxa"/>
+              <w:end w:w="120" w:type="dxa"/>
+            </w:tcMar>
+            <w:vAlign w:val="center"/>
+          </w:tcPr>
+          <w:p>
+            <w:pPr>
+              <w:spacing w:before="0" w:after="0" w:line="252" w:lineRule="auto"/>
+            </w:pPr>
+            <w:r>
+              <w:rPr>
+                <w:rFonts w:ascii="Calibri" w:hAnsi="Calibri" w:eastAsia="Microsoft YaHei"/>
+                <w:b w:val="0"/>
+                <w:color w:val="333333"/>
+                <w:sz w:val="15"/>
+              </w:rPr>
+              <w:t>0/10</w:t>
+            </w:r>
+          </w:p>
+        </w:tc>
+        <w:tc>
+          <w:tcPr>
+            <w:tcW w:type="dxa" w:w="1050"/>
+            <w:tcMar>
+              <w:top w:w="80" w:type="dxa"/>
+              <w:start w:w="120" w:type="dxa"/>
+              <w:bottom w:w="80" w:type="dxa"/>
+              <w:end w:w="120" w:type="dxa"/>
+            </w:tcMar>
+            <w:vAlign w:val="center"/>
+          </w:tcPr>
+          <w:p>
+            <w:pPr>
+              <w:spacing w:before="0" w:after="0" w:line="252" w:lineRule="auto"/>
+            </w:pPr>
+            <w:r>
+              <w:rPr>
+                <w:rFonts w:ascii="Calibri" w:hAnsi="Calibri" w:eastAsia="Microsoft YaHei"/>
+                <w:b w:val="0"/>
+                <w:color w:val="333333"/>
+                <w:sz w:val="15"/>
+              </w:rPr>
+              <w:t>100.0%</w:t>
+            </w:r>
+          </w:p>
+        </w:tc>
+        <w:tc>
+          <w:tcPr>
+            <w:tcW w:type="dxa" w:w="2710"/>
+            <w:tcMar>
+              <w:top w:w="80" w:type="dxa"/>
+              <w:start w:w="120" w:type="dxa"/>
+              <w:bottom w:w="80" w:type="dxa"/>
+              <w:end w:w="120" w:type="dxa"/>
+            </w:tcMar>
+            <w:vAlign w:val="center"/>
+          </w:tcPr>
+          <w:p>
+            <w:pPr>
+              <w:spacing w:before="0" w:after="0" w:line="252" w:lineRule="auto"/>
+            </w:pPr>
+            <w:r>
+              <w:rPr>
+                <w:rFonts w:ascii="Calibri" w:hAnsi="Calibri" w:eastAsia="Microsoft YaHei"/>
+                <w:b w:val="0"/>
+                <w:color w:val="333333"/>
+                <w:sz w:val="15"/>
+              </w:rPr>
+              <w:t>100.0%</w:t>
+            </w:r>
+          </w:p>
+        </w:tc>
+      </w:tr>
+      <w:tr>
+        <w:trPr>
+          <w:cantSplit/>
+        </w:trPr>
+        <w:tc>
+          <w:tcPr>
+            <w:tcW w:type="dxa" w:w="1150"/>
+            <w:tcMar>
+              <w:top w:w="80" w:type="dxa"/>
+              <w:start w:w="120" w:type="dxa"/>
+              <w:bottom w:w="80" w:type="dxa"/>
+              <w:end w:w="120" w:type="dxa"/>
+            </w:tcMar>
+            <w:vAlign w:val="center"/>
+            <w:shd w:fill="F4F8FC"/>
+          </w:tcPr>
+          <w:p>
+            <w:pPr>
+              <w:spacing w:before="0" w:after="0" w:line="252" w:lineRule="auto"/>
+            </w:pPr>
+            <w:r>
+              <w:rPr>
+                <w:rFonts w:ascii="Calibri" w:hAnsi="Calibri" w:eastAsia="Microsoft YaHei"/>
+                <w:b w:val="0"/>
+                <w:color w:val="333333"/>
+                <w:sz w:val="15"/>
+              </w:rPr>
+              <w:t>25 应急避难所</w:t>
+            </w:r>
+          </w:p>
+        </w:tc>
+        <w:tc>
+          <w:tcPr>
+            <w:tcW w:type="dxa" w:w="1650"/>
+            <w:tcMar>
+              <w:top w:w="80" w:type="dxa"/>
+              <w:start w:w="120" w:type="dxa"/>
+              <w:bottom w:w="80" w:type="dxa"/>
+              <w:end w:w="120" w:type="dxa"/>
+            </w:tcMar>
+            <w:vAlign w:val="center"/>
+            <w:shd w:fill="F4F8FC"/>
+          </w:tcPr>
+          <w:p>
+            <w:pPr>
+              <w:spacing w:before="0" w:after="0" w:line="252" w:lineRule="auto"/>
+            </w:pPr>
+            <w:r>
+              <w:rPr>
+                <w:rFonts w:ascii="Calibri" w:hAnsi="Calibri" w:eastAsia="Microsoft YaHei"/>
+                <w:b w:val="0"/>
+                <w:color w:val="333333"/>
+                <w:sz w:val="15"/>
+              </w:rPr>
+              <w:t>MAF动态+强制披露</w:t>
+            </w:r>
+          </w:p>
+        </w:tc>
+        <w:tc>
+          <w:tcPr>
+            <w:tcW w:type="dxa" w:w="1000"/>
+            <w:tcMar>
+              <w:top w:w="80" w:type="dxa"/>
+              <w:start w:w="120" w:type="dxa"/>
+              <w:bottom w:w="80" w:type="dxa"/>
+              <w:end w:w="120" w:type="dxa"/>
+            </w:tcMar>
+            <w:vAlign w:val="center"/>
+            <w:shd w:fill="F4F8FC"/>
+          </w:tcPr>
+          <w:p>
+            <w:pPr>
+              <w:spacing w:before="0" w:after="0" w:line="252" w:lineRule="auto"/>
+            </w:pPr>
+            <w:r>
+              <w:rPr>
+                <w:rFonts w:ascii="Calibri" w:hAnsi="Calibri" w:eastAsia="Microsoft YaHei"/>
+                <w:b w:val="0"/>
+                <w:color w:val="333333"/>
+                <w:sz w:val="15"/>
+              </w:rPr>
+              <w:t>85.0%</w:t>
+            </w:r>
+          </w:p>
+        </w:tc>
+        <w:tc>
+          <w:tcPr>
+            <w:tcW w:type="dxa" w:w="850"/>
+            <w:tcMar>
+              <w:top w:w="80" w:type="dxa"/>
+              <w:start w:w="120" w:type="dxa"/>
+              <w:bottom w:w="80" w:type="dxa"/>
+              <w:end w:w="120" w:type="dxa"/>
+            </w:tcMar>
+            <w:vAlign w:val="center"/>
+            <w:shd w:fill="F4F8FC"/>
+          </w:tcPr>
+          <w:p>
+            <w:pPr>
+              <w:spacing w:before="0" w:after="0" w:line="252" w:lineRule="auto"/>
+            </w:pPr>
+            <w:r>
+              <w:rPr>
+                <w:rFonts w:ascii="Calibri" w:hAnsi="Calibri" w:eastAsia="Microsoft YaHei"/>
+                <w:b w:val="0"/>
+                <w:color w:val="333333"/>
+                <w:sz w:val="15"/>
+              </w:rPr>
+              <w:t>10/10</w:t>
+            </w:r>
+          </w:p>
+        </w:tc>
+        <w:tc>
+          <w:tcPr>
+            <w:tcW w:type="dxa" w:w="950"/>
+            <w:tcMar>
+              <w:top w:w="80" w:type="dxa"/>
+              <w:start w:w="120" w:type="dxa"/>
+              <w:bottom w:w="80" w:type="dxa"/>
+              <w:end w:w="120" w:type="dxa"/>
+            </w:tcMar>
+            <w:vAlign w:val="center"/>
+            <w:shd w:fill="F4F8FC"/>
+          </w:tcPr>
+          <w:p>
+            <w:pPr>
+              <w:spacing w:before="0" w:after="0" w:line="252" w:lineRule="auto"/>
+            </w:pPr>
+            <w:r>
+              <w:rPr>
+                <w:rFonts w:ascii="Calibri" w:hAnsi="Calibri" w:eastAsia="Microsoft YaHei"/>
+                <w:b w:val="0"/>
+                <w:color w:val="333333"/>
+                <w:sz w:val="15"/>
+              </w:rPr>
+              <w:t>0/10</w:t>
+            </w:r>
+          </w:p>
+        </w:tc>
+        <w:tc>
+          <w:tcPr>
+            <w:tcW w:type="dxa" w:w="1050"/>
+            <w:tcMar>
+              <w:top w:w="80" w:type="dxa"/>
+              <w:start w:w="120" w:type="dxa"/>
+              <w:bottom w:w="80" w:type="dxa"/>
+              <w:end w:w="120" w:type="dxa"/>
+            </w:tcMar>
+            <w:vAlign w:val="center"/>
+            <w:shd w:fill="F4F8FC"/>
+          </w:tcPr>
+          <w:p>
+            <w:pPr>
+              <w:spacing w:before="0" w:after="0" w:line="252" w:lineRule="auto"/>
+            </w:pPr>
+            <w:r>
+              <w:rPr>
+                <w:rFonts w:ascii="Calibri" w:hAnsi="Calibri" w:eastAsia="Microsoft YaHei"/>
+                <w:b w:val="0"/>
+                <w:color w:val="333333"/>
+                <w:sz w:val="15"/>
+              </w:rPr>
+              <w:t>100.0%</w:t>
+            </w:r>
+          </w:p>
+        </w:tc>
+        <w:tc>
+          <w:tcPr>
+            <w:tcW w:type="dxa" w:w="2710"/>
+            <w:tcMar>
+              <w:top w:w="80" w:type="dxa"/>
+              <w:start w:w="120" w:type="dxa"/>
+              <w:bottom w:w="80" w:type="dxa"/>
+              <w:end w:w="120" w:type="dxa"/>
+            </w:tcMar>
+            <w:vAlign w:val="center"/>
+            <w:shd w:fill="F4F8FC"/>
+          </w:tcPr>
+          <w:p>
+            <w:pPr>
+              <w:spacing w:before="0" w:after="0" w:line="252" w:lineRule="auto"/>
+            </w:pPr>
+            <w:r>
+              <w:rPr>
+                <w:rFonts w:ascii="Calibri" w:hAnsi="Calibri" w:eastAsia="Microsoft YaHei"/>
+                <w:b w:val="0"/>
+                <w:color w:val="333333"/>
+                <w:sz w:val="15"/>
+              </w:rPr>
+              <w:t>100.0%</w:t>
+            </w:r>
+          </w:p>
+        </w:tc>
+      </w:tr>
+      <w:tr>
+        <w:trPr>
+          <w:cantSplit/>
+        </w:trPr>
+        <w:tc>
+          <w:tcPr>
+            <w:tcW w:type="dxa" w:w="1150"/>
+            <w:tcMar>
+              <w:top w:w="80" w:type="dxa"/>
+              <w:start w:w="120" w:type="dxa"/>
+              <w:bottom w:w="80" w:type="dxa"/>
+              <w:end w:w="120" w:type="dxa"/>
+            </w:tcMar>
+            <w:vAlign w:val="center"/>
+          </w:tcPr>
+          <w:p>
+            <w:pPr>
+              <w:spacing w:before="0" w:after="0" w:line="252" w:lineRule="auto"/>
+            </w:pPr>
+            <w:r>
+              <w:rPr>
+                <w:rFonts w:ascii="Calibri" w:hAnsi="Calibri" w:eastAsia="Microsoft YaHei"/>
+                <w:b w:val="0"/>
+                <w:color w:val="333333"/>
+                <w:sz w:val="15"/>
+              </w:rPr>
+              <w:t>25 应急避难所</w:t>
+            </w:r>
+          </w:p>
+        </w:tc>
+        <w:tc>
+          <w:tcPr>
+            <w:tcW w:type="dxa" w:w="1650"/>
+            <w:tcMar>
+              <w:top w:w="80" w:type="dxa"/>
+              <w:start w:w="120" w:type="dxa"/>
+              <w:bottom w:w="80" w:type="dxa"/>
+              <w:end w:w="120" w:type="dxa"/>
+            </w:tcMar>
+            <w:vAlign w:val="center"/>
+          </w:tcPr>
+          <w:p>
+            <w:pPr>
+              <w:spacing w:before="0" w:after="0" w:line="252" w:lineRule="auto"/>
+            </w:pPr>
+            <w:r>
+              <w:rPr>
+                <w:rFonts w:ascii="Calibri" w:hAnsi="Calibri" w:eastAsia="Microsoft YaHei"/>
+                <w:b w:val="0"/>
+                <w:color w:val="333333"/>
+                <w:sz w:val="15"/>
+              </w:rPr>
+              <w:t>Structured协议12条</w:t>
+            </w:r>
+          </w:p>
+        </w:tc>
+        <w:tc>
+          <w:tcPr>
+            <w:tcW w:type="dxa" w:w="1000"/>
+            <w:tcMar>
+              <w:top w:w="80" w:type="dxa"/>
+              <w:start w:w="120" w:type="dxa"/>
+              <w:bottom w:w="80" w:type="dxa"/>
+              <w:end w:w="120" w:type="dxa"/>
+            </w:tcMar>
+            <w:vAlign w:val="center"/>
+          </w:tcPr>
+          <w:p>
+            <w:pPr>
+              <w:spacing w:before="0" w:after="0" w:line="252" w:lineRule="auto"/>
+            </w:pPr>
+            <w:r>
+              <w:rPr>
+                <w:rFonts w:ascii="Calibri" w:hAnsi="Calibri" w:eastAsia="Microsoft YaHei"/>
+                <w:b w:val="0"/>
+                <w:color w:val="333333"/>
+                <w:sz w:val="15"/>
+              </w:rPr>
+              <w:t>67.5%</w:t>
+            </w:r>
+          </w:p>
+        </w:tc>
+        <w:tc>
+          <w:tcPr>
+            <w:tcW w:type="dxa" w:w="850"/>
+            <w:tcMar>
+              <w:top w:w="80" w:type="dxa"/>
+              <w:start w:w="120" w:type="dxa"/>
+              <w:bottom w:w="80" w:type="dxa"/>
+              <w:end w:w="120" w:type="dxa"/>
+            </w:tcMar>
+            <w:vAlign w:val="center"/>
+          </w:tcPr>
+          <w:p>
+            <w:pPr>
+              <w:spacing w:before="0" w:after="0" w:line="252" w:lineRule="auto"/>
+            </w:pPr>
+            <w:r>
+              <w:rPr>
+                <w:rFonts w:ascii="Calibri" w:hAnsi="Calibri" w:eastAsia="Microsoft YaHei"/>
+                <w:b w:val="0"/>
+                <w:color w:val="333333"/>
+                <w:sz w:val="15"/>
+              </w:rPr>
+              <w:t>9/10</w:t>
+            </w:r>
+          </w:p>
+        </w:tc>
+        <w:tc>
+          <w:tcPr>
+            <w:tcW w:type="dxa" w:w="950"/>
+            <w:tcMar>
+              <w:top w:w="80" w:type="dxa"/>
+              <w:start w:w="120" w:type="dxa"/>
+              <w:bottom w:w="80" w:type="dxa"/>
+              <w:end w:w="120" w:type="dxa"/>
+            </w:tcMar>
+            <w:vAlign w:val="center"/>
+          </w:tcPr>
+          <w:p>
+            <w:pPr>
+              <w:spacing w:before="0" w:after="0" w:line="252" w:lineRule="auto"/>
+            </w:pPr>
+            <w:r>
+              <w:rPr>
+                <w:rFonts w:ascii="Calibri" w:hAnsi="Calibri" w:eastAsia="Microsoft YaHei"/>
+                <w:b w:val="0"/>
+                <w:color w:val="333333"/>
+                <w:sz w:val="15"/>
+              </w:rPr>
+              <w:t>1/10</w:t>
+            </w:r>
+          </w:p>
+        </w:tc>
+        <w:tc>
+          <w:tcPr>
+            <w:tcW w:type="dxa" w:w="1050"/>
+            <w:tcMar>
+              <w:top w:w="80" w:type="dxa"/>
+              <w:start w:w="120" w:type="dxa"/>
+              <w:bottom w:w="80" w:type="dxa"/>
+              <w:end w:w="120" w:type="dxa"/>
+            </w:tcMar>
+            <w:vAlign w:val="center"/>
+          </w:tcPr>
+          <w:p>
+            <w:pPr>
+              <w:spacing w:before="0" w:after="0" w:line="252" w:lineRule="auto"/>
+            </w:pPr>
+            <w:r>
+              <w:rPr>
+                <w:rFonts w:ascii="Calibri" w:hAnsi="Calibri" w:eastAsia="Microsoft YaHei"/>
+                <w:b w:val="0"/>
+                <w:color w:val="333333"/>
+                <w:sz w:val="15"/>
+              </w:rPr>
+              <w:t>90.0%</w:t>
+            </w:r>
+          </w:p>
+        </w:tc>
+        <w:tc>
+          <w:tcPr>
+            <w:tcW w:type="dxa" w:w="2710"/>
+            <w:tcMar>
+              <w:top w:w="80" w:type="dxa"/>
+              <w:start w:w="120" w:type="dxa"/>
+              <w:bottom w:w="80" w:type="dxa"/>
+              <w:end w:w="120" w:type="dxa"/>
+            </w:tcMar>
+            <w:vAlign w:val="center"/>
+          </w:tcPr>
+          <w:p>
+            <w:pPr>
+              <w:spacing w:before="0" w:after="0" w:line="252" w:lineRule="auto"/>
+            </w:pPr>
+            <w:r>
+              <w:rPr>
+                <w:rFonts w:ascii="Calibri" w:hAnsi="Calibri" w:eastAsia="Microsoft YaHei"/>
+                <w:b w:val="0"/>
+                <w:color w:val="333333"/>
+                <w:sz w:val="15"/>
+              </w:rPr>
+              <w:t>100.0%</w:t>
+            </w:r>
+          </w:p>
+        </w:tc>
+      </w:tr>
+      <w:tr>
+        <w:trPr>
+          <w:cantSplit/>
+        </w:trPr>
+        <w:tc>
+          <w:tcPr>
+            <w:tcW w:type="dxa" w:w="1150"/>
+            <w:tcMar>
+              <w:top w:w="80" w:type="dxa"/>
+              <w:start w:w="120" w:type="dxa"/>
+              <w:bottom w:w="80" w:type="dxa"/>
+              <w:end w:w="120" w:type="dxa"/>
+            </w:tcMar>
+            <w:vAlign w:val="center"/>
+            <w:shd w:fill="F4F8FC"/>
+          </w:tcPr>
+          <w:p>
+            <w:pPr>
+              <w:spacing w:before="0" w:after="0" w:line="252" w:lineRule="auto"/>
+            </w:pPr>
+            <w:r>
+              <w:rPr>
+                <w:rFonts w:ascii="Calibri" w:hAnsi="Calibri" w:eastAsia="Microsoft YaHei"/>
+                <w:b w:val="0"/>
+                <w:color w:val="333333"/>
+                <w:sz w:val="15"/>
+              </w:rPr>
+              <w:t>25 应急避难所</w:t>
+            </w:r>
+          </w:p>
+        </w:tc>
+        <w:tc>
+          <w:tcPr>
+            <w:tcW w:type="dxa" w:w="1650"/>
+            <w:tcMar>
+              <w:top w:w="80" w:type="dxa"/>
+              <w:start w:w="120" w:type="dxa"/>
+              <w:bottom w:w="80" w:type="dxa"/>
+              <w:end w:w="120" w:type="dxa"/>
+            </w:tcMar>
+            <w:vAlign w:val="center"/>
+            <w:shd w:fill="F4F8FC"/>
+          </w:tcPr>
+          <w:p>
+            <w:pPr>
+              <w:spacing w:before="0" w:after="0" w:line="252" w:lineRule="auto"/>
+            </w:pPr>
+            <w:r>
+              <w:rPr>
+                <w:rFonts w:ascii="Calibri" w:hAnsi="Calibri" w:eastAsia="Microsoft YaHei"/>
+                <w:b w:val="0"/>
+                <w:color w:val="333333"/>
+                <w:sz w:val="15"/>
+              </w:rPr>
+              <w:t>固定轮转12条</w:t>
+            </w:r>
+          </w:p>
+        </w:tc>
+        <w:tc>
+          <w:tcPr>
+            <w:tcW w:type="dxa" w:w="1000"/>
+            <w:tcMar>
+              <w:top w:w="80" w:type="dxa"/>
+              <w:start w:w="120" w:type="dxa"/>
+              <w:bottom w:w="80" w:type="dxa"/>
+              <w:end w:w="120" w:type="dxa"/>
+            </w:tcMar>
+            <w:vAlign w:val="center"/>
+            <w:shd w:fill="F4F8FC"/>
+          </w:tcPr>
+          <w:p>
+            <w:pPr>
+              <w:spacing w:before="0" w:after="0" w:line="252" w:lineRule="auto"/>
+            </w:pPr>
+            <w:r>
+              <w:rPr>
+                <w:rFonts w:ascii="Calibri" w:hAnsi="Calibri" w:eastAsia="Microsoft YaHei"/>
+                <w:b w:val="0"/>
+                <w:color w:val="333333"/>
+                <w:sz w:val="15"/>
+              </w:rPr>
+              <w:t>—</w:t>
+            </w:r>
+          </w:p>
+        </w:tc>
+        <w:tc>
+          <w:tcPr>
+            <w:tcW w:type="dxa" w:w="850"/>
+            <w:tcMar>
+              <w:top w:w="80" w:type="dxa"/>
+              <w:start w:w="120" w:type="dxa"/>
+              <w:bottom w:w="80" w:type="dxa"/>
+              <w:end w:w="120" w:type="dxa"/>
+            </w:tcMar>
+            <w:vAlign w:val="center"/>
+            <w:shd w:fill="F4F8FC"/>
+          </w:tcPr>
+          <w:p>
+            <w:pPr>
+              <w:spacing w:before="0" w:after="0" w:line="252" w:lineRule="auto"/>
+            </w:pPr>
+            <w:r>
+              <w:rPr>
+                <w:rFonts w:ascii="Calibri" w:hAnsi="Calibri" w:eastAsia="Microsoft YaHei"/>
+                <w:b w:val="0"/>
+                <w:color w:val="333333"/>
+                <w:sz w:val="15"/>
+              </w:rPr>
+              <w:t>9/10</w:t>
+            </w:r>
+          </w:p>
+        </w:tc>
+        <w:tc>
+          <w:tcPr>
+            <w:tcW w:type="dxa" w:w="950"/>
+            <w:tcMar>
+              <w:top w:w="80" w:type="dxa"/>
+              <w:start w:w="120" w:type="dxa"/>
+              <w:bottom w:w="80" w:type="dxa"/>
+              <w:end w:w="120" w:type="dxa"/>
+            </w:tcMar>
+            <w:vAlign w:val="center"/>
+            <w:shd w:fill="F4F8FC"/>
+          </w:tcPr>
+          <w:p>
+            <w:pPr>
+              <w:spacing w:before="0" w:after="0" w:line="252" w:lineRule="auto"/>
+            </w:pPr>
+            <w:r>
+              <w:rPr>
+                <w:rFonts w:ascii="Calibri" w:hAnsi="Calibri" w:eastAsia="Microsoft YaHei"/>
+                <w:b w:val="0"/>
+                <w:color w:val="333333"/>
+                <w:sz w:val="15"/>
+              </w:rPr>
+              <w:t>1/10</w:t>
+            </w:r>
+          </w:p>
+        </w:tc>
+        <w:tc>
+          <w:tcPr>
+            <w:tcW w:type="dxa" w:w="1050"/>
+            <w:tcMar>
+              <w:top w:w="80" w:type="dxa"/>
+              <w:start w:w="120" w:type="dxa"/>
+              <w:bottom w:w="80" w:type="dxa"/>
+              <w:end w:w="120" w:type="dxa"/>
+            </w:tcMar>
+            <w:vAlign w:val="center"/>
+            <w:shd w:fill="F4F8FC"/>
+          </w:tcPr>
+          <w:p>
+            <w:pPr>
+              <w:spacing w:before="0" w:after="0" w:line="252" w:lineRule="auto"/>
+            </w:pPr>
+            <w:r>
+              <w:rPr>
+                <w:rFonts w:ascii="Calibri" w:hAnsi="Calibri" w:eastAsia="Microsoft YaHei"/>
+                <w:b w:val="0"/>
+                <w:color w:val="333333"/>
+                <w:sz w:val="15"/>
+              </w:rPr>
+              <w:t>90.0%</w:t>
+            </w:r>
+          </w:p>
+        </w:tc>
+        <w:tc>
+          <w:tcPr>
+            <w:tcW w:type="dxa" w:w="2710"/>
+            <w:tcMar>
+              <w:top w:w="80" w:type="dxa"/>
+              <w:start w:w="120" w:type="dxa"/>
+              <w:bottom w:w="80" w:type="dxa"/>
+              <w:end w:w="120" w:type="dxa"/>
+            </w:tcMar>
+            <w:vAlign w:val="center"/>
+            <w:shd w:fill="F4F8FC"/>
+          </w:tcPr>
+          <w:p>
+            <w:pPr>
+              <w:spacing w:before="0" w:after="0" w:line="252" w:lineRule="auto"/>
+            </w:pPr>
+            <w:r>
+              <w:rPr>
+                <w:rFonts w:ascii="Calibri" w:hAnsi="Calibri" w:eastAsia="Microsoft YaHei"/>
+                <w:b w:val="0"/>
+                <w:color w:val="333333"/>
+                <w:sz w:val="15"/>
+              </w:rPr>
+              <w:t>100.0%</w:t>
+            </w:r>
+          </w:p>
+        </w:tc>
+      </w:tr>
+      <w:tr>
+        <w:trPr>
+          <w:cantSplit/>
+        </w:trPr>
+        <w:tc>
+          <w:tcPr>
+            <w:tcW w:type="dxa" w:w="1150"/>
+            <w:tcMar>
+              <w:top w:w="80" w:type="dxa"/>
+              <w:start w:w="120" w:type="dxa"/>
+              <w:bottom w:w="80" w:type="dxa"/>
+              <w:end w:w="120" w:type="dxa"/>
+            </w:tcMar>
+            <w:vAlign w:val="center"/>
+          </w:tcPr>
+          <w:p>
+            <w:pPr>
+              <w:spacing w:before="0" w:after="0" w:line="252" w:lineRule="auto"/>
+            </w:pPr>
+            <w:r>
+              <w:rPr>
+                <w:rFonts w:ascii="Calibri" w:hAnsi="Calibri" w:eastAsia="Microsoft YaHei"/>
+                <w:b w:val="0"/>
+                <w:color w:val="333333"/>
+                <w:sz w:val="15"/>
+              </w:rPr>
+              <w:t>25 应急避难所</w:t>
+            </w:r>
+          </w:p>
+        </w:tc>
+        <w:tc>
+          <w:tcPr>
+            <w:tcW w:type="dxa" w:w="1650"/>
+            <w:tcMar>
+              <w:top w:w="80" w:type="dxa"/>
+              <w:start w:w="120" w:type="dxa"/>
+              <w:bottom w:w="80" w:type="dxa"/>
+              <w:end w:w="120" w:type="dxa"/>
+            </w:tcMar>
+            <w:vAlign w:val="center"/>
+          </w:tcPr>
+          <w:p>
+            <w:pPr>
+              <w:spacing w:before="0" w:after="0" w:line="252" w:lineRule="auto"/>
+            </w:pPr>
+            <w:r>
+              <w:rPr>
+                <w:rFonts w:ascii="Calibri" w:hAnsi="Calibri" w:eastAsia="Microsoft YaHei"/>
+                <w:b w:val="0"/>
+                <w:color w:val="333333"/>
+                <w:sz w:val="15"/>
+              </w:rPr>
+              <w:t>单智能体直接作答</w:t>
+            </w:r>
+          </w:p>
+        </w:tc>
+        <w:tc>
+          <w:tcPr>
+            <w:tcW w:type="dxa" w:w="1000"/>
+            <w:tcMar>
+              <w:top w:w="80" w:type="dxa"/>
+              <w:start w:w="120" w:type="dxa"/>
+              <w:bottom w:w="80" w:type="dxa"/>
+              <w:end w:w="120" w:type="dxa"/>
+            </w:tcMar>
+            <w:vAlign w:val="center"/>
+          </w:tcPr>
+          <w:p>
+            <w:pPr>
+              <w:spacing w:before="0" w:after="0" w:line="252" w:lineRule="auto"/>
+            </w:pPr>
+            <w:r>
+              <w:rPr>
+                <w:rFonts w:ascii="Calibri" w:hAnsi="Calibri" w:eastAsia="Microsoft YaHei"/>
+                <w:b w:val="0"/>
+                <w:color w:val="333333"/>
+                <w:sz w:val="15"/>
+              </w:rPr>
+              <w:t>—</w:t>
+            </w:r>
+          </w:p>
+        </w:tc>
+        <w:tc>
+          <w:tcPr>
+            <w:tcW w:type="dxa" w:w="850"/>
+            <w:tcMar>
+              <w:top w:w="80" w:type="dxa"/>
+              <w:start w:w="120" w:type="dxa"/>
+              <w:bottom w:w="80" w:type="dxa"/>
+              <w:end w:w="120" w:type="dxa"/>
+            </w:tcMar>
+            <w:vAlign w:val="center"/>
+          </w:tcPr>
+          <w:p>
+            <w:pPr>
+              <w:spacing w:before="0" w:after="0" w:line="252" w:lineRule="auto"/>
+            </w:pPr>
+            <w:r>
+              <w:rPr>
+                <w:rFonts w:ascii="Calibri" w:hAnsi="Calibri" w:eastAsia="Microsoft YaHei"/>
+                <w:b w:val="0"/>
+                <w:color w:val="333333"/>
+                <w:sz w:val="15"/>
+              </w:rPr>
+              <w:t>4/10</w:t>
+            </w:r>
+          </w:p>
+        </w:tc>
+        <w:tc>
+          <w:tcPr>
+            <w:tcW w:type="dxa" w:w="950"/>
+            <w:tcMar>
+              <w:top w:w="80" w:type="dxa"/>
+              <w:start w:w="120" w:type="dxa"/>
+              <w:bottom w:w="80" w:type="dxa"/>
+              <w:end w:w="120" w:type="dxa"/>
+            </w:tcMar>
+            <w:vAlign w:val="center"/>
+          </w:tcPr>
+          <w:p>
+            <w:pPr>
+              <w:spacing w:before="0" w:after="0" w:line="252" w:lineRule="auto"/>
+            </w:pPr>
+            <w:r>
+              <w:rPr>
+                <w:rFonts w:ascii="Calibri" w:hAnsi="Calibri" w:eastAsia="Microsoft YaHei"/>
+                <w:b w:val="0"/>
+                <w:color w:val="333333"/>
+                <w:sz w:val="15"/>
+              </w:rPr>
+              <w:t>6/10</w:t>
+            </w:r>
+          </w:p>
+        </w:tc>
+        <w:tc>
+          <w:tcPr>
+            <w:tcW w:type="dxa" w:w="1050"/>
+            <w:tcMar>
+              <w:top w:w="80" w:type="dxa"/>
+              <w:start w:w="120" w:type="dxa"/>
+              <w:bottom w:w="80" w:type="dxa"/>
+              <w:end w:w="120" w:type="dxa"/>
+            </w:tcMar>
+            <w:vAlign w:val="center"/>
+          </w:tcPr>
+          <w:p>
+            <w:pPr>
+              <w:spacing w:before="0" w:after="0" w:line="252" w:lineRule="auto"/>
+            </w:pPr>
+            <w:r>
+              <w:rPr>
+                <w:rFonts w:ascii="Calibri" w:hAnsi="Calibri" w:eastAsia="Microsoft YaHei"/>
+                <w:b w:val="0"/>
+                <w:color w:val="333333"/>
+                <w:sz w:val="15"/>
+              </w:rPr>
+              <w:t>40.0%</w:t>
+            </w:r>
+          </w:p>
+        </w:tc>
+        <w:tc>
+          <w:tcPr>
+            <w:tcW w:type="dxa" w:w="2710"/>
+            <w:tcMar>
+              <w:top w:w="80" w:type="dxa"/>
+              <w:start w:w="120" w:type="dxa"/>
+              <w:bottom w:w="80" w:type="dxa"/>
+              <w:end w:w="120" w:type="dxa"/>
+            </w:tcMar>
+            <w:vAlign w:val="center"/>
+          </w:tcPr>
+          <w:p>
+            <w:pPr>
+              <w:spacing w:before="0" w:after="0" w:line="252" w:lineRule="auto"/>
+            </w:pPr>
+            <w:r>
+              <w:rPr>
+                <w:rFonts w:ascii="Calibri" w:hAnsi="Calibri" w:eastAsia="Microsoft YaHei"/>
+                <w:b w:val="0"/>
+                <w:color w:val="333333"/>
+                <w:sz w:val="15"/>
+              </w:rPr>
+              <w:t>100.0%</w:t>
+            </w:r>
+          </w:p>
+        </w:tc>
+      </w:tr>
+      <w:tr>
+        <w:trPr>
+          <w:cantSplit/>
+        </w:trPr>
+        <w:tc>
+          <w:tcPr>
+            <w:tcW w:type="dxa" w:w="1150"/>
+            <w:tcMar>
+              <w:top w:w="80" w:type="dxa"/>
+              <w:start w:w="120" w:type="dxa"/>
+              <w:bottom w:w="80" w:type="dxa"/>
+              <w:end w:w="120" w:type="dxa"/>
+            </w:tcMar>
+            <w:vAlign w:val="center"/>
+            <w:shd w:fill="F4F8FC"/>
+          </w:tcPr>
+          <w:p>
+            <w:pPr>
+              <w:spacing w:before="0" w:after="0" w:line="252" w:lineRule="auto"/>
+            </w:pPr>
+            <w:r>
+              <w:rPr>
+                <w:rFonts w:ascii="Calibri" w:hAnsi="Calibri" w:eastAsia="Microsoft YaHei"/>
+                <w:b w:val="0"/>
+                <w:color w:val="333333"/>
+                <w:sz w:val="15"/>
+              </w:rPr>
+              <w:t>25 应急避难所</w:t>
+            </w:r>
+          </w:p>
+        </w:tc>
+        <w:tc>
+          <w:tcPr>
+            <w:tcW w:type="dxa" w:w="1650"/>
+            <w:tcMar>
+              <w:top w:w="80" w:type="dxa"/>
+              <w:start w:w="120" w:type="dxa"/>
+              <w:bottom w:w="80" w:type="dxa"/>
+              <w:end w:w="120" w:type="dxa"/>
+            </w:tcMar>
+            <w:vAlign w:val="center"/>
+            <w:shd w:fill="F4F8FC"/>
+          </w:tcPr>
+          <w:p>
+            <w:pPr>
+              <w:spacing w:before="0" w:after="0" w:line="252" w:lineRule="auto"/>
+            </w:pPr>
+            <w:r>
+              <w:rPr>
+                <w:rFonts w:ascii="Calibri" w:hAnsi="Calibri" w:eastAsia="Microsoft YaHei"/>
+                <w:b w:val="0"/>
+                <w:color w:val="333333"/>
+                <w:sz w:val="15"/>
+              </w:rPr>
               <w:t>单智能体+15轮反思</w:t>
             </w:r>
           </w:p>
@@ -8207,6 +9435,387 @@
                 <w:sz w:val="15"/>
               </w:rPr>
               <w:t>30.0%</w:t>
+            </w:r>
+          </w:p>
+        </w:tc>
+        <w:tc>
+          <w:tcPr>
+            <w:tcW w:type="dxa" w:w="2710"/>
+            <w:tcMar>
+              <w:top w:w="80" w:type="dxa"/>
+              <w:start w:w="120" w:type="dxa"/>
+              <w:bottom w:w="80" w:type="dxa"/>
+              <w:end w:w="120" w:type="dxa"/>
+            </w:tcMar>
+            <w:vAlign w:val="center"/>
+            <w:shd w:fill="F4F8FC"/>
+          </w:tcPr>
+          <w:p>
+            <w:pPr>
+              <w:spacing w:before="0" w:after="0" w:line="252" w:lineRule="auto"/>
+            </w:pPr>
+            <w:r>
+              <w:rPr>
+                <w:rFonts w:ascii="Calibri" w:hAnsi="Calibri" w:eastAsia="Microsoft YaHei"/>
+                <w:b w:val="0"/>
+                <w:color w:val="333333"/>
+                <w:sz w:val="15"/>
+              </w:rPr>
+              <w:t>100.0%</w:t>
+            </w:r>
+          </w:p>
+        </w:tc>
+      </w:tr>
+      <w:tr>
+        <w:trPr>
+          <w:cantSplit/>
+        </w:trPr>
+        <w:tc>
+          <w:tcPr>
+            <w:tcW w:type="dxa" w:w="1150"/>
+            <w:tcMar>
+              <w:top w:w="80" w:type="dxa"/>
+              <w:start w:w="120" w:type="dxa"/>
+              <w:bottom w:w="80" w:type="dxa"/>
+              <w:end w:w="120" w:type="dxa"/>
+            </w:tcMar>
+            <w:vAlign w:val="center"/>
+          </w:tcPr>
+          <w:p>
+            <w:pPr>
+              <w:spacing w:before="0" w:after="0" w:line="252" w:lineRule="auto"/>
+            </w:pPr>
+            <w:r>
+              <w:rPr>
+                <w:rFonts w:ascii="Calibri" w:hAnsi="Calibri" w:eastAsia="Microsoft YaHei"/>
+                <w:b w:val="0"/>
+                <w:color w:val="333333"/>
+                <w:sz w:val="15"/>
+              </w:rPr>
+              <w:t>25 应急避难所</w:t>
+            </w:r>
+          </w:p>
+        </w:tc>
+        <w:tc>
+          <w:tcPr>
+            <w:tcW w:type="dxa" w:w="1650"/>
+            <w:tcMar>
+              <w:top w:w="80" w:type="dxa"/>
+              <w:start w:w="120" w:type="dxa"/>
+              <w:bottom w:w="80" w:type="dxa"/>
+              <w:end w:w="120" w:type="dxa"/>
+            </w:tcMar>
+            <w:vAlign w:val="center"/>
+          </w:tcPr>
+          <w:p>
+            <w:pPr>
+              <w:spacing w:before="0" w:after="0" w:line="252" w:lineRule="auto"/>
+            </w:pPr>
+            <w:r>
+              <w:rPr>
+                <w:rFonts w:ascii="Calibri" w:hAnsi="Calibri" w:eastAsia="Microsoft YaHei"/>
+                <w:b w:val="0"/>
+                <w:color w:val="333333"/>
+                <w:sz w:val="15"/>
+              </w:rPr>
+              <w:t>固定轮转16条（提前停止）</w:t>
+            </w:r>
+          </w:p>
+        </w:tc>
+        <w:tc>
+          <w:tcPr>
+            <w:tcW w:type="dxa" w:w="1000"/>
+            <w:tcMar>
+              <w:top w:w="80" w:type="dxa"/>
+              <w:start w:w="120" w:type="dxa"/>
+              <w:bottom w:w="80" w:type="dxa"/>
+              <w:end w:w="120" w:type="dxa"/>
+            </w:tcMar>
+            <w:vAlign w:val="center"/>
+          </w:tcPr>
+          <w:p>
+            <w:pPr>
+              <w:spacing w:before="0" w:after="0" w:line="252" w:lineRule="auto"/>
+            </w:pPr>
+            <w:r>
+              <w:rPr>
+                <w:rFonts w:ascii="Calibri" w:hAnsi="Calibri" w:eastAsia="Microsoft YaHei"/>
+                <w:b w:val="0"/>
+                <w:color w:val="333333"/>
+                <w:sz w:val="15"/>
+              </w:rPr>
+              <w:t>60.0%</w:t>
+            </w:r>
+          </w:p>
+        </w:tc>
+        <w:tc>
+          <w:tcPr>
+            <w:tcW w:type="dxa" w:w="850"/>
+            <w:tcMar>
+              <w:top w:w="80" w:type="dxa"/>
+              <w:start w:w="120" w:type="dxa"/>
+              <w:bottom w:w="80" w:type="dxa"/>
+              <w:end w:w="120" w:type="dxa"/>
+            </w:tcMar>
+            <w:vAlign w:val="center"/>
+          </w:tcPr>
+          <w:p>
+            <w:pPr>
+              <w:spacing w:before="0" w:after="0" w:line="252" w:lineRule="auto"/>
+            </w:pPr>
+            <w:r>
+              <w:rPr>
+                <w:rFonts w:ascii="Calibri" w:hAnsi="Calibri" w:eastAsia="Microsoft YaHei"/>
+                <w:b w:val="0"/>
+                <w:color w:val="333333"/>
+                <w:sz w:val="15"/>
+              </w:rPr>
+              <w:t>9/10</w:t>
+            </w:r>
+          </w:p>
+        </w:tc>
+        <w:tc>
+          <w:tcPr>
+            <w:tcW w:type="dxa" w:w="950"/>
+            <w:tcMar>
+              <w:top w:w="80" w:type="dxa"/>
+              <w:start w:w="120" w:type="dxa"/>
+              <w:bottom w:w="80" w:type="dxa"/>
+              <w:end w:w="120" w:type="dxa"/>
+            </w:tcMar>
+            <w:vAlign w:val="center"/>
+          </w:tcPr>
+          <w:p>
+            <w:pPr>
+              <w:spacing w:before="0" w:after="0" w:line="252" w:lineRule="auto"/>
+            </w:pPr>
+            <w:r>
+              <w:rPr>
+                <w:rFonts w:ascii="Calibri" w:hAnsi="Calibri" w:eastAsia="Microsoft YaHei"/>
+                <w:b w:val="0"/>
+                <w:color w:val="333333"/>
+                <w:sz w:val="15"/>
+              </w:rPr>
+              <w:t>1/10</w:t>
+            </w:r>
+          </w:p>
+        </w:tc>
+        <w:tc>
+          <w:tcPr>
+            <w:tcW w:type="dxa" w:w="1050"/>
+            <w:tcMar>
+              <w:top w:w="80" w:type="dxa"/>
+              <w:start w:w="120" w:type="dxa"/>
+              <w:bottom w:w="80" w:type="dxa"/>
+              <w:end w:w="120" w:type="dxa"/>
+            </w:tcMar>
+            <w:vAlign w:val="center"/>
+          </w:tcPr>
+          <w:p>
+            <w:pPr>
+              <w:spacing w:before="0" w:after="0" w:line="252" w:lineRule="auto"/>
+            </w:pPr>
+            <w:r>
+              <w:rPr>
+                <w:rFonts w:ascii="Calibri" w:hAnsi="Calibri" w:eastAsia="Microsoft YaHei"/>
+                <w:b w:val="0"/>
+                <w:color w:val="333333"/>
+                <w:sz w:val="15"/>
+              </w:rPr>
+              <w:t>90.0%</w:t>
+            </w:r>
+          </w:p>
+        </w:tc>
+        <w:tc>
+          <w:tcPr>
+            <w:tcW w:type="dxa" w:w="2710"/>
+            <w:tcMar>
+              <w:top w:w="80" w:type="dxa"/>
+              <w:start w:w="120" w:type="dxa"/>
+              <w:bottom w:w="80" w:type="dxa"/>
+              <w:end w:w="120" w:type="dxa"/>
+            </w:tcMar>
+            <w:vAlign w:val="center"/>
+          </w:tcPr>
+          <w:p>
+            <w:pPr>
+              <w:spacing w:before="0" w:after="0" w:line="252" w:lineRule="auto"/>
+            </w:pPr>
+            <w:r>
+              <w:rPr>
+                <w:rFonts w:ascii="Calibri" w:hAnsi="Calibri" w:eastAsia="Microsoft YaHei"/>
+                <w:b w:val="0"/>
+                <w:color w:val="333333"/>
+                <w:sz w:val="15"/>
+              </w:rPr>
+              <w:t>100.0%</w:t>
+            </w:r>
+          </w:p>
+        </w:tc>
+      </w:tr>
+      <w:tr>
+        <w:trPr>
+          <w:cantSplit/>
+        </w:trPr>
+        <w:tc>
+          <w:tcPr>
+            <w:tcW w:type="dxa" w:w="1150"/>
+            <w:tcMar>
+              <w:top w:w="80" w:type="dxa"/>
+              <w:start w:w="120" w:type="dxa"/>
+              <w:bottom w:w="80" w:type="dxa"/>
+              <w:end w:w="120" w:type="dxa"/>
+            </w:tcMar>
+            <w:vAlign w:val="center"/>
+            <w:shd w:fill="F4F8FC"/>
+          </w:tcPr>
+          <w:p>
+            <w:pPr>
+              <w:spacing w:before="0" w:after="0" w:line="252" w:lineRule="auto"/>
+            </w:pPr>
+            <w:r>
+              <w:rPr>
+                <w:rFonts w:ascii="Calibri" w:hAnsi="Calibri" w:eastAsia="Microsoft YaHei"/>
+                <w:b w:val="0"/>
+                <w:color w:val="333333"/>
+                <w:sz w:val="15"/>
+              </w:rPr>
+              <w:t>25 应急避难所</w:t>
+            </w:r>
+          </w:p>
+        </w:tc>
+        <w:tc>
+          <w:tcPr>
+            <w:tcW w:type="dxa" w:w="1650"/>
+            <w:tcMar>
+              <w:top w:w="80" w:type="dxa"/>
+              <w:start w:w="120" w:type="dxa"/>
+              <w:bottom w:w="80" w:type="dxa"/>
+              <w:end w:w="120" w:type="dxa"/>
+            </w:tcMar>
+            <w:vAlign w:val="center"/>
+            <w:shd w:fill="F4F8FC"/>
+          </w:tcPr>
+          <w:p>
+            <w:pPr>
+              <w:spacing w:before="0" w:after="0" w:line="252" w:lineRule="auto"/>
+            </w:pPr>
+            <w:r>
+              <w:rPr>
+                <w:rFonts w:ascii="Calibri" w:hAnsi="Calibri" w:eastAsia="Microsoft YaHei"/>
+                <w:b w:val="0"/>
+                <w:color w:val="333333"/>
+                <w:sz w:val="15"/>
+              </w:rPr>
+              <w:t>固定轮转32条（提前停止）</w:t>
+            </w:r>
+          </w:p>
+        </w:tc>
+        <w:tc>
+          <w:tcPr>
+            <w:tcW w:type="dxa" w:w="1000"/>
+            <w:tcMar>
+              <w:top w:w="80" w:type="dxa"/>
+              <w:start w:w="120" w:type="dxa"/>
+              <w:bottom w:w="80" w:type="dxa"/>
+              <w:end w:w="120" w:type="dxa"/>
+            </w:tcMar>
+            <w:vAlign w:val="center"/>
+            <w:shd w:fill="F4F8FC"/>
+          </w:tcPr>
+          <w:p>
+            <w:pPr>
+              <w:spacing w:before="0" w:after="0" w:line="252" w:lineRule="auto"/>
+            </w:pPr>
+            <w:r>
+              <w:rPr>
+                <w:rFonts w:ascii="Calibri" w:hAnsi="Calibri" w:eastAsia="Microsoft YaHei"/>
+                <w:b w:val="0"/>
+                <w:color w:val="333333"/>
+                <w:sz w:val="15"/>
+              </w:rPr>
+              <w:t>60.0%</w:t>
+            </w:r>
+          </w:p>
+        </w:tc>
+        <w:tc>
+          <w:tcPr>
+            <w:tcW w:type="dxa" w:w="850"/>
+            <w:tcMar>
+              <w:top w:w="80" w:type="dxa"/>
+              <w:start w:w="120" w:type="dxa"/>
+              <w:bottom w:w="80" w:type="dxa"/>
+              <w:end w:w="120" w:type="dxa"/>
+            </w:tcMar>
+            <w:vAlign w:val="center"/>
+            <w:shd w:fill="F4F8FC"/>
+          </w:tcPr>
+          <w:p>
+            <w:pPr>
+              <w:spacing w:before="0" w:after="0" w:line="252" w:lineRule="auto"/>
+            </w:pPr>
+            <w:r>
+              <w:rPr>
+                <w:rFonts w:ascii="Calibri" w:hAnsi="Calibri" w:eastAsia="Microsoft YaHei"/>
+                <w:b w:val="0"/>
+                <w:color w:val="333333"/>
+                <w:sz w:val="15"/>
+              </w:rPr>
+              <w:t>8/10</w:t>
+            </w:r>
+          </w:p>
+        </w:tc>
+        <w:tc>
+          <w:tcPr>
+            <w:tcW w:type="dxa" w:w="950"/>
+            <w:tcMar>
+              <w:top w:w="80" w:type="dxa"/>
+              <w:start w:w="120" w:type="dxa"/>
+              <w:bottom w:w="80" w:type="dxa"/>
+              <w:end w:w="120" w:type="dxa"/>
+            </w:tcMar>
+            <w:vAlign w:val="center"/>
+            <w:shd w:fill="F4F8FC"/>
+          </w:tcPr>
+          <w:p>
+            <w:pPr>
+              <w:spacing w:before="0" w:after="0" w:line="252" w:lineRule="auto"/>
+            </w:pPr>
+            <w:r>
+              <w:rPr>
+                <w:rFonts w:ascii="Calibri" w:hAnsi="Calibri" w:eastAsia="Microsoft YaHei"/>
+                <w:b w:val="0"/>
+                <w:color w:val="333333"/>
+                <w:sz w:val="15"/>
+              </w:rPr>
+              <w:t>1/10</w:t>
+            </w:r>
+          </w:p>
+        </w:tc>
+        <w:tc>
+          <w:tcPr>
+            <w:tcW w:type="dxa" w:w="1050"/>
+            <w:tcMar>
+              <w:top w:w="80" w:type="dxa"/>
+              <w:start w:w="120" w:type="dxa"/>
+              <w:bottom w:w="80" w:type="dxa"/>
+              <w:end w:w="120" w:type="dxa"/>
+            </w:tcMar>
+            <w:vAlign w:val="center"/>
+            <w:shd w:fill="F4F8FC"/>
+          </w:tcPr>
+          <w:p>
+            <w:pPr>
+              <w:spacing w:before="0" w:after="0" w:line="252" w:lineRule="auto"/>
+            </w:pPr>
+            <w:r>
+              <w:rPr>
+                <w:rFonts w:ascii="Calibri" w:hAnsi="Calibri" w:eastAsia="Microsoft YaHei"/>
+                <w:b w:val="0"/>
+                <w:color w:val="333333"/>
+                <w:sz w:val="15"/>
+              </w:rPr>
+              <w:t>85.0%</w:t>
             </w:r>
           </w:p>
         </w:tc>
@@ -9056,6 +10665,179 @@
                 <w:sz w:val="18"/>
               </w:rPr>
               <w:t>33/40</w:t>
+            </w:r>
+          </w:p>
+        </w:tc>
+      </w:tr>
+      <w:tr>
+        <w:trPr>
+          <w:cantSplit/>
+        </w:trPr>
+        <w:tc>
+          <w:tcPr>
+            <w:tcW w:type="dxa" w:w="3360"/>
+            <w:tcMar>
+              <w:top w:w="80" w:type="dxa"/>
+              <w:start w:w="120" w:type="dxa"/>
+              <w:bottom w:w="80" w:type="dxa"/>
+              <w:end w:w="120" w:type="dxa"/>
+            </w:tcMar>
+            <w:vAlign w:val="center"/>
+          </w:tcPr>
+          <w:p>
+            <w:pPr>
+              <w:spacing w:before="0" w:after="0" w:line="252" w:lineRule="auto"/>
+            </w:pPr>
+            <w:r>
+              <w:rPr>
+                <w:rFonts w:ascii="Calibri" w:hAnsi="Calibri" w:eastAsia="Microsoft YaHei"/>
+                <w:b w:val="0"/>
+                <w:color w:val="333333"/>
+                <w:sz w:val="18"/>
+              </w:rPr>
+              <w:t>固定轮转16条（提前停止）</w:t>
+            </w:r>
+          </w:p>
+        </w:tc>
+        <w:tc>
+          <w:tcPr>
+            <w:tcW w:type="dxa" w:w="3000"/>
+            <w:tcMar>
+              <w:top w:w="80" w:type="dxa"/>
+              <w:start w:w="120" w:type="dxa"/>
+              <w:bottom w:w="80" w:type="dxa"/>
+              <w:end w:w="120" w:type="dxa"/>
+            </w:tcMar>
+            <w:vAlign w:val="center"/>
+          </w:tcPr>
+          <w:p>
+            <w:pPr>
+              <w:spacing w:before="0" w:after="0" w:line="252" w:lineRule="auto"/>
+              <w:jc w:val="left"/>
+            </w:pPr>
+            <w:r>
+              <w:rPr>
+                <w:rFonts w:ascii="Calibri" w:hAnsi="Calibri" w:eastAsia="Microsoft YaHei"/>
+                <w:b w:val="0"/>
+                <w:color w:val="333333"/>
+                <w:sz w:val="18"/>
+              </w:rPr>
+              <w:t>20/40</w:t>
+            </w:r>
+          </w:p>
+        </w:tc>
+        <w:tc>
+          <w:tcPr>
+            <w:tcW w:type="dxa" w:w="3000"/>
+            <w:tcMar>
+              <w:top w:w="80" w:type="dxa"/>
+              <w:start w:w="120" w:type="dxa"/>
+              <w:bottom w:w="80" w:type="dxa"/>
+              <w:end w:w="120" w:type="dxa"/>
+            </w:tcMar>
+            <w:vAlign w:val="center"/>
+          </w:tcPr>
+          <w:p>
+            <w:pPr>
+              <w:spacing w:before="0" w:after="0" w:line="252" w:lineRule="auto"/>
+              <w:jc w:val="left"/>
+            </w:pPr>
+            <w:r>
+              <w:rPr>
+                <w:rFonts w:ascii="Calibri" w:hAnsi="Calibri" w:eastAsia="Microsoft YaHei"/>
+                <w:b w:val="0"/>
+                <w:color w:val="333333"/>
+                <w:sz w:val="18"/>
+              </w:rPr>
+              <w:t>20/40</w:t>
+            </w:r>
+          </w:p>
+        </w:tc>
+      </w:tr>
+      <w:tr>
+        <w:trPr>
+          <w:cantSplit/>
+        </w:trPr>
+        <w:tc>
+          <w:tcPr>
+            <w:tcW w:type="dxa" w:w="3360"/>
+            <w:tcMar>
+              <w:top w:w="80" w:type="dxa"/>
+              <w:start w:w="120" w:type="dxa"/>
+              <w:bottom w:w="80" w:type="dxa"/>
+              <w:end w:w="120" w:type="dxa"/>
+            </w:tcMar>
+            <w:vAlign w:val="center"/>
+            <w:shd w:fill="F4F8FC"/>
+          </w:tcPr>
+          <w:p>
+            <w:pPr>
+              <w:spacing w:before="0" w:after="0" w:line="252" w:lineRule="auto"/>
+            </w:pPr>
+            <w:r>
+              <w:rPr>
+                <w:rFonts w:ascii="Calibri" w:hAnsi="Calibri" w:eastAsia="Microsoft YaHei"/>
+                <w:b w:val="0"/>
+                <w:color w:val="333333"/>
+                <w:sz w:val="18"/>
+              </w:rPr>
+              <w:t>固定轮转32条（提前停止）</w:t>
+            </w:r>
+          </w:p>
+        </w:tc>
+        <w:tc>
+          <w:tcPr>
+            <w:tcW w:type="dxa" w:w="3000"/>
+            <w:tcMar>
+              <w:top w:w="80" w:type="dxa"/>
+              <w:start w:w="120" w:type="dxa"/>
+              <w:bottom w:w="80" w:type="dxa"/>
+              <w:end w:w="120" w:type="dxa"/>
+            </w:tcMar>
+            <w:vAlign w:val="center"/>
+            <w:shd w:fill="F4F8FC"/>
+          </w:tcPr>
+          <w:p>
+            <w:pPr>
+              <w:spacing w:before="0" w:after="0" w:line="252" w:lineRule="auto"/>
+              <w:jc w:val="left"/>
+            </w:pPr>
+            <w:r>
+              <w:rPr>
+                <w:rFonts w:ascii="Calibri" w:hAnsi="Calibri" w:eastAsia="Microsoft YaHei"/>
+                <w:b w:val="0"/>
+                <w:color w:val="333333"/>
+                <w:sz w:val="18"/>
+              </w:rPr>
+              <w:t>20/40</w:t>
+            </w:r>
+          </w:p>
+        </w:tc>
+        <w:tc>
+          <w:tcPr>
+            <w:tcW w:type="dxa" w:w="3000"/>
+            <w:tcMar>
+              <w:top w:w="80" w:type="dxa"/>
+              <w:start w:w="120" w:type="dxa"/>
+              <w:bottom w:w="80" w:type="dxa"/>
+              <w:end w:w="120" w:type="dxa"/>
+            </w:tcMar>
+            <w:vAlign w:val="center"/>
+            <w:shd w:fill="F4F8FC"/>
+          </w:tcPr>
+          <w:p>
+            <w:pPr>
+              <w:spacing w:before="0" w:after="0" w:line="252" w:lineRule="auto"/>
+              <w:jc w:val="left"/>
+            </w:pPr>
+            <w:r>
+              <w:rPr>
+                <w:rFonts w:ascii="Calibri" w:hAnsi="Calibri" w:eastAsia="Microsoft YaHei"/>
+                <w:b w:val="0"/>
+                <w:color w:val="333333"/>
+                <w:sz w:val="18"/>
+              </w:rPr>
+              <w:t>19/40</w:t>
             </w:r>
           </w:p>
         </w:tc>
@@ -9145,6 +10927,19 @@
       </w:r>
     </w:p>
     <w:p>
+      <w:pPr>
+        <w:pStyle w:val="Heading2"/>
+      </w:pPr>
+      <w:r>
+        <w:t>6. 提前停止是安全的</w:t>
+      </w:r>
+    </w:p>
+    <w:p>
+      <w:r>
+        <w:t>固定轮转截断到 16 条、32 条与完整 60 条的结果完全一致（均为 20/40，ID1/ID25 全对、ID5/ID7 全错）。共识在前几轮就已固化：答得对的题 4 轮就够，答错的题继续 44 条也不会翻盘。因此老师问的“达成一致为何还要往下”的答案是：不需要，可以提前停止，省下约 2/3 的发言预算。</w:t>
+      </w:r>
+    </w:p>
+    <w:p>
       <w:r>
         <w:br w:type="page"/>
       </w:r>
@@ -9179,7 +10974,7 @@
     </w:p>
     <w:p>
       <w:r>
-        <w:t>提前停止对照：观察共识稳定后继续发言是否会打破错误共识（老师此前问过“达成一致为何还要往下”）。</w:t>
+        <w:t>把提前停止规则接入正式协议（如连续两轮全体一致即停止），验证节省预算的同时结果不变。</w:t>
       </w:r>
     </w:p>
     <w:p>

</xml_diff>

<commit_message>
docs: appendix on the blind-review sign-off sheets and human re-check flow in master report
</commit_message>
<xml_diff>
--- a/reports/实验总报告（自老师提要求以来）_2026-08-03.docx
+++ b/reports/实验总报告（自老师提要求以来）_2026-08-03.docx
@@ -10998,6 +10998,854 @@
           <w:sz w:val="22"/>
         </w:rPr>
         <w:t>老师提的要求全部有对应实验和数字：题目对标了论文、披露率 0 修好了、Structured 复现了、单智能体和预算质疑都补了对照、盲审做了独立复核。剩下两个未闭环：真人签核和强模型复验，都只需要人工/算力，不需要再改设计。</w:t>
+      </w:r>
+    </w:p>
+    <w:p>
+      <w:pPr>
+        <w:pStyle w:val="Heading1"/>
+      </w:pPr>
+      <w:r>
+        <w:t>附录：盲审签核表与复核流程</w:t>
+      </w:r>
+    </w:p>
+    <w:p>
+      <w:r>
+        <w:t>144 项盲化签核表有三份配套文件，对应三种使用状态：</w:t>
+      </w:r>
+    </w:p>
+    <w:tbl>
+      <w:tblPr>
+        <w:tblStyle w:val="TableGrid"/>
+        <w:tblW w:type="dxa" w:w="9360"/>
+        <w:jc w:val="left"/>
+        <w:tblLayout w:type="fixed"/>
+        <w:tblLook w:firstColumn="1" w:firstRow="1" w:lastColumn="0" w:lastRow="0" w:noHBand="0" w:noVBand="1" w:val="04A0"/>
+        <w:tblInd w:type="dxa" w:w="120"/>
+      </w:tblPr>
+      <w:tblGrid>
+        <w:gridCol w:w="3000"/>
+        <w:gridCol w:w="2300"/>
+        <w:gridCol w:w="4060"/>
+      </w:tblGrid>
+      <w:tr>
+        <w:trPr>
+          <w:tblHeader w:val="true"/>
+          <w:cantSplit/>
+        </w:trPr>
+        <w:tc>
+          <w:tcPr>
+            <w:tcW w:type="dxa" w:w="3000"/>
+            <w:tcMar>
+              <w:top w:w="80" w:type="dxa"/>
+              <w:start w:w="120" w:type="dxa"/>
+              <w:bottom w:w="80" w:type="dxa"/>
+              <w:end w:w="120" w:type="dxa"/>
+            </w:tcMar>
+            <w:vAlign w:val="center"/>
+            <w:shd w:fill="F2F4F7"/>
+          </w:tcPr>
+          <w:p>
+            <w:pPr>
+              <w:spacing w:before="0" w:after="0" w:line="252" w:lineRule="auto"/>
+            </w:pPr>
+            <w:r>
+              <w:rPr>
+                <w:rFonts w:ascii="Calibri" w:hAnsi="Calibri" w:eastAsia="Microsoft YaHei"/>
+                <w:b/>
+                <w:color w:val="17365D"/>
+                <w:sz w:val="16"/>
+              </w:rPr>
+              <w:t>文件</w:t>
+            </w:r>
+          </w:p>
+        </w:tc>
+        <w:tc>
+          <w:tcPr>
+            <w:tcW w:type="dxa" w:w="2300"/>
+            <w:tcMar>
+              <w:top w:w="80" w:type="dxa"/>
+              <w:start w:w="120" w:type="dxa"/>
+              <w:bottom w:w="80" w:type="dxa"/>
+              <w:end w:w="120" w:type="dxa"/>
+            </w:tcMar>
+            <w:vAlign w:val="center"/>
+            <w:shd w:fill="F2F4F7"/>
+          </w:tcPr>
+          <w:p>
+            <w:pPr>
+              <w:spacing w:before="0" w:after="0" w:line="252" w:lineRule="auto"/>
+              <w:jc w:val="left"/>
+            </w:pPr>
+            <w:r>
+              <w:rPr>
+                <w:rFonts w:ascii="Calibri" w:hAnsi="Calibri" w:eastAsia="Microsoft YaHei"/>
+                <w:b/>
+                <w:color w:val="17365D"/>
+                <w:sz w:val="16"/>
+              </w:rPr>
+              <w:t>状态</w:t>
+            </w:r>
+          </w:p>
+        </w:tc>
+        <w:tc>
+          <w:tcPr>
+            <w:tcW w:type="dxa" w:w="4060"/>
+            <w:tcMar>
+              <w:top w:w="80" w:type="dxa"/>
+              <w:start w:w="120" w:type="dxa"/>
+              <w:bottom w:w="80" w:type="dxa"/>
+              <w:end w:w="120" w:type="dxa"/>
+            </w:tcMar>
+            <w:vAlign w:val="center"/>
+            <w:shd w:fill="F2F4F7"/>
+          </w:tcPr>
+          <w:p>
+            <w:pPr>
+              <w:spacing w:before="0" w:after="0" w:line="252" w:lineRule="auto"/>
+              <w:jc w:val="left"/>
+            </w:pPr>
+            <w:r>
+              <w:rPr>
+                <w:rFonts w:ascii="Calibri" w:hAnsi="Calibri" w:eastAsia="Microsoft YaHei"/>
+                <w:b/>
+                <w:color w:val="17365D"/>
+                <w:sz w:val="16"/>
+              </w:rPr>
+              <w:t>用途</w:t>
+            </w:r>
+          </w:p>
+        </w:tc>
+      </w:tr>
+      <w:tr>
+        <w:trPr>
+          <w:cantSplit/>
+        </w:trPr>
+        <w:tc>
+          <w:tcPr>
+            <w:tcW w:type="dxa" w:w="3000"/>
+            <w:tcMar>
+              <w:top w:w="80" w:type="dxa"/>
+              <w:start w:w="120" w:type="dxa"/>
+              <w:bottom w:w="80" w:type="dxa"/>
+              <w:end w:w="120" w:type="dxa"/>
+            </w:tcMar>
+            <w:vAlign w:val="center"/>
+          </w:tcPr>
+          <w:p>
+            <w:pPr>
+              <w:spacing w:before="0" w:after="0" w:line="252" w:lineRule="auto"/>
+            </w:pPr>
+            <w:r>
+              <w:rPr>
+                <w:rFonts w:ascii="Calibri" w:hAnsi="Calibri" w:eastAsia="Microsoft YaHei"/>
+                <w:b w:val="0"/>
+                <w:color w:val="333333"/>
+                <w:sz w:val="16"/>
+              </w:rPr>
+              <w:t>盲审签核表_144项_2026-08-03.xlsx</w:t>
+            </w:r>
+          </w:p>
+        </w:tc>
+        <w:tc>
+          <w:tcPr>
+            <w:tcW w:type="dxa" w:w="2300"/>
+            <w:tcMar>
+              <w:top w:w="80" w:type="dxa"/>
+              <w:start w:w="120" w:type="dxa"/>
+              <w:bottom w:w="80" w:type="dxa"/>
+              <w:end w:w="120" w:type="dxa"/>
+            </w:tcMar>
+            <w:vAlign w:val="center"/>
+          </w:tcPr>
+          <w:p>
+            <w:pPr>
+              <w:spacing w:before="0" w:after="0" w:line="252" w:lineRule="auto"/>
+              <w:jc w:val="left"/>
+            </w:pPr>
+            <w:r>
+              <w:rPr>
+                <w:rFonts w:ascii="Calibri" w:hAnsi="Calibri" w:eastAsia="Microsoft YaHei"/>
+                <w:b w:val="0"/>
+                <w:color w:val="333333"/>
+                <w:sz w:val="16"/>
+              </w:rPr>
+              <w:t>空白版</w:t>
+            </w:r>
+          </w:p>
+        </w:tc>
+        <w:tc>
+          <w:tcPr>
+            <w:tcW w:type="dxa" w:w="4060"/>
+            <w:tcMar>
+              <w:top w:w="80" w:type="dxa"/>
+              <w:start w:w="120" w:type="dxa"/>
+              <w:bottom w:w="80" w:type="dxa"/>
+              <w:end w:w="120" w:type="dxa"/>
+            </w:tcMar>
+            <w:vAlign w:val="center"/>
+          </w:tcPr>
+          <w:p>
+            <w:pPr>
+              <w:spacing w:before="0" w:after="0" w:line="252" w:lineRule="auto"/>
+              <w:jc w:val="left"/>
+            </w:pPr>
+            <w:r>
+              <w:rPr>
+                <w:rFonts w:ascii="Calibri" w:hAnsi="Calibri" w:eastAsia="Microsoft YaHei"/>
+                <w:b w:val="0"/>
+                <w:color w:val="333333"/>
+                <w:sz w:val="16"/>
+              </w:rPr>
+              <w:t>给真人填写；含 6 条判定规则说明和 是/否 下拉；不含 AI/规则标签，保持盲审</w:t>
+            </w:r>
+          </w:p>
+        </w:tc>
+      </w:tr>
+      <w:tr>
+        <w:trPr>
+          <w:cantSplit/>
+        </w:trPr>
+        <w:tc>
+          <w:tcPr>
+            <w:tcW w:type="dxa" w:w="3000"/>
+            <w:tcMar>
+              <w:top w:w="80" w:type="dxa"/>
+              <w:start w:w="120" w:type="dxa"/>
+              <w:bottom w:w="80" w:type="dxa"/>
+              <w:end w:w="120" w:type="dxa"/>
+            </w:tcMar>
+            <w:vAlign w:val="center"/>
+            <w:shd w:fill="F4F8FC"/>
+          </w:tcPr>
+          <w:p>
+            <w:pPr>
+              <w:spacing w:before="0" w:after="0" w:line="252" w:lineRule="auto"/>
+            </w:pPr>
+            <w:r>
+              <w:rPr>
+                <w:rFonts w:ascii="Calibri" w:hAnsi="Calibri" w:eastAsia="Microsoft YaHei"/>
+                <w:b w:val="0"/>
+                <w:color w:val="333333"/>
+                <w:sz w:val="16"/>
+              </w:rPr>
+              <w:t>盲审签核表_144项_2026-08-03_已填版.xlsx</w:t>
+            </w:r>
+          </w:p>
+        </w:tc>
+        <w:tc>
+          <w:tcPr>
+            <w:tcW w:type="dxa" w:w="2300"/>
+            <w:tcMar>
+              <w:top w:w="80" w:type="dxa"/>
+              <w:start w:w="120" w:type="dxa"/>
+              <w:bottom w:w="80" w:type="dxa"/>
+              <w:end w:w="120" w:type="dxa"/>
+            </w:tcMar>
+            <w:vAlign w:val="center"/>
+            <w:shd w:fill="F4F8FC"/>
+          </w:tcPr>
+          <w:p>
+            <w:pPr>
+              <w:spacing w:before="0" w:after="0" w:line="252" w:lineRule="auto"/>
+              <w:jc w:val="left"/>
+            </w:pPr>
+            <w:r>
+              <w:rPr>
+                <w:rFonts w:ascii="Calibri" w:hAnsi="Calibri" w:eastAsia="Microsoft YaHei"/>
+                <w:b w:val="0"/>
+                <w:color w:val="333333"/>
+                <w:sz w:val="16"/>
+              </w:rPr>
+              <w:t>已填版（Codex 独立评审）</w:t>
+            </w:r>
+          </w:p>
+        </w:tc>
+        <w:tc>
+          <w:tcPr>
+            <w:tcW w:type="dxa" w:w="4060"/>
+            <w:tcMar>
+              <w:top w:w="80" w:type="dxa"/>
+              <w:start w:w="120" w:type="dxa"/>
+              <w:bottom w:w="80" w:type="dxa"/>
+              <w:end w:w="120" w:type="dxa"/>
+            </w:tcMar>
+            <w:vAlign w:val="center"/>
+            <w:shd w:fill="F4F8FC"/>
+          </w:tcPr>
+          <w:p>
+            <w:pPr>
+              <w:spacing w:before="0" w:after="0" w:line="252" w:lineRule="auto"/>
+              <w:jc w:val="left"/>
+            </w:pPr>
+            <w:r>
+              <w:rPr>
+                <w:rFonts w:ascii="Calibri" w:hAnsi="Calibri" w:eastAsia="Microsoft YaHei"/>
+                <w:b w:val="0"/>
+                <w:color w:val="333333"/>
+                <w:sz w:val="16"/>
+              </w:rPr>
+              <w:t>73 项披露/71 项未披露，每条带证据消息 ID 与原文引句，逐条注明评审者</w:t>
+            </w:r>
+          </w:p>
+        </w:tc>
+      </w:tr>
+      <w:tr>
+        <w:trPr>
+          <w:cantSplit/>
+        </w:trPr>
+        <w:tc>
+          <w:tcPr>
+            <w:tcW w:type="dxa" w:w="3000"/>
+            <w:tcMar>
+              <w:top w:w="80" w:type="dxa"/>
+              <w:start w:w="120" w:type="dxa"/>
+              <w:bottom w:w="80" w:type="dxa"/>
+              <w:end w:w="120" w:type="dxa"/>
+            </w:tcMar>
+            <w:vAlign w:val="center"/>
+          </w:tcPr>
+          <w:p>
+            <w:pPr>
+              <w:spacing w:before="0" w:after="0" w:line="252" w:lineRule="auto"/>
+            </w:pPr>
+            <w:r>
+              <w:rPr>
+                <w:rFonts w:ascii="Calibri" w:hAnsi="Calibri" w:eastAsia="Microsoft YaHei"/>
+                <w:b w:val="0"/>
+                <w:color w:val="333333"/>
+                <w:sz w:val="16"/>
+              </w:rPr>
+              <w:t>reports/xlsx_to_queue_csv.py</w:t>
+            </w:r>
+          </w:p>
+        </w:tc>
+        <w:tc>
+          <w:tcPr>
+            <w:tcW w:type="dxa" w:w="2300"/>
+            <w:tcMar>
+              <w:top w:w="80" w:type="dxa"/>
+              <w:start w:w="120" w:type="dxa"/>
+              <w:bottom w:w="80" w:type="dxa"/>
+              <w:end w:w="120" w:type="dxa"/>
+            </w:tcMar>
+            <w:vAlign w:val="center"/>
+          </w:tcPr>
+          <w:p>
+            <w:pPr>
+              <w:spacing w:before="0" w:after="0" w:line="252" w:lineRule="auto"/>
+              <w:jc w:val="left"/>
+            </w:pPr>
+            <w:r>
+              <w:rPr>
+                <w:rFonts w:ascii="Calibri" w:hAnsi="Calibri" w:eastAsia="Microsoft YaHei"/>
+                <w:b w:val="0"/>
+                <w:color w:val="333333"/>
+                <w:sz w:val="16"/>
+              </w:rPr>
+              <w:t>回算工具</w:t>
+            </w:r>
+          </w:p>
+        </w:tc>
+        <w:tc>
+          <w:tcPr>
+            <w:tcW w:type="dxa" w:w="4060"/>
+            <w:tcMar>
+              <w:top w:w="80" w:type="dxa"/>
+              <w:start w:w="120" w:type="dxa"/>
+              <w:bottom w:w="80" w:type="dxa"/>
+              <w:end w:w="120" w:type="dxa"/>
+            </w:tcMar>
+            <w:vAlign w:val="center"/>
+          </w:tcPr>
+          <w:p>
+            <w:pPr>
+              <w:spacing w:before="0" w:after="0" w:line="252" w:lineRule="auto"/>
+              <w:jc w:val="left"/>
+            </w:pPr>
+            <w:r>
+              <w:rPr>
+                <w:rFonts w:ascii="Calibri" w:hAnsi="Calibri" w:eastAsia="Microsoft YaHei"/>
+                <w:b w:val="0"/>
+                <w:color w:val="333333"/>
+                <w:sz w:val="16"/>
+              </w:rPr>
+              <w:t>把填好的 Excel 转回签核 CSV，供 run_hiddenbench_blind_review.py --from-human-queue 重算人工一致率、精确率、召回率与修订披露率</w:t>
+            </w:r>
+          </w:p>
+        </w:tc>
+      </w:tr>
+    </w:tbl>
+    <w:p>
+      <w:pPr>
+        <w:spacing w:after="0"/>
+      </w:pPr>
+    </w:p>
+    <w:p>
+      <w:pPr>
+        <w:pStyle w:val="Heading2"/>
+      </w:pPr>
+      <w:r>
+        <w:t>已填版指标（独立模型评审，非人工金标准）</w:t>
+      </w:r>
+    </w:p>
+    <w:tbl>
+      <w:tblPr>
+        <w:tblStyle w:val="TableGrid"/>
+        <w:tblW w:type="dxa" w:w="9360"/>
+        <w:jc w:val="left"/>
+        <w:tblLayout w:type="fixed"/>
+        <w:tblLook w:firstColumn="1" w:firstRow="1" w:lastColumn="0" w:lastRow="0" w:noHBand="0" w:noVBand="1" w:val="04A0"/>
+        <w:tblInd w:type="dxa" w:w="120"/>
+      </w:tblPr>
+      <w:tblGrid>
+        <w:gridCol w:w="3000"/>
+        <w:gridCol w:w="3180"/>
+        <w:gridCol w:w="3180"/>
+      </w:tblGrid>
+      <w:tr>
+        <w:trPr>
+          <w:tblHeader w:val="true"/>
+          <w:cantSplit/>
+        </w:trPr>
+        <w:tc>
+          <w:tcPr>
+            <w:tcW w:type="dxa" w:w="3000"/>
+            <w:tcMar>
+              <w:top w:w="80" w:type="dxa"/>
+              <w:start w:w="120" w:type="dxa"/>
+              <w:bottom w:w="80" w:type="dxa"/>
+              <w:end w:w="120" w:type="dxa"/>
+            </w:tcMar>
+            <w:vAlign w:val="center"/>
+            <w:shd w:fill="F2F4F7"/>
+          </w:tcPr>
+          <w:p>
+            <w:pPr>
+              <w:spacing w:before="0" w:after="0" w:line="252" w:lineRule="auto"/>
+            </w:pPr>
+            <w:r>
+              <w:rPr>
+                <w:rFonts w:ascii="Calibri" w:hAnsi="Calibri" w:eastAsia="Microsoft YaHei"/>
+                <w:b/>
+                <w:color w:val="17365D"/>
+                <w:sz w:val="18"/>
+              </w:rPr>
+              <w:t>指标</w:t>
+            </w:r>
+          </w:p>
+        </w:tc>
+        <w:tc>
+          <w:tcPr>
+            <w:tcW w:type="dxa" w:w="3180"/>
+            <w:tcMar>
+              <w:top w:w="80" w:type="dxa"/>
+              <w:start w:w="120" w:type="dxa"/>
+              <w:bottom w:w="80" w:type="dxa"/>
+              <w:end w:w="120" w:type="dxa"/>
+            </w:tcMar>
+            <w:vAlign w:val="center"/>
+            <w:shd w:fill="F2F4F7"/>
+          </w:tcPr>
+          <w:p>
+            <w:pPr>
+              <w:spacing w:before="0" w:after="0" w:line="252" w:lineRule="auto"/>
+              <w:jc w:val="left"/>
+            </w:pPr>
+            <w:r>
+              <w:rPr>
+                <w:rFonts w:ascii="Calibri" w:hAnsi="Calibri" w:eastAsia="Microsoft YaHei"/>
+                <w:b/>
+                <w:color w:val="17365D"/>
+                <w:sz w:val="18"/>
+              </w:rPr>
+              <w:t>DeepSeek 自审</w:t>
+            </w:r>
+          </w:p>
+        </w:tc>
+        <w:tc>
+          <w:tcPr>
+            <w:tcW w:type="dxa" w:w="3180"/>
+            <w:tcMar>
+              <w:top w:w="80" w:type="dxa"/>
+              <w:start w:w="120" w:type="dxa"/>
+              <w:bottom w:w="80" w:type="dxa"/>
+              <w:end w:w="120" w:type="dxa"/>
+            </w:tcMar>
+            <w:vAlign w:val="center"/>
+            <w:shd w:fill="F2F4F7"/>
+          </w:tcPr>
+          <w:p>
+            <w:pPr>
+              <w:spacing w:before="0" w:after="0" w:line="252" w:lineRule="auto"/>
+              <w:jc w:val="left"/>
+            </w:pPr>
+            <w:r>
+              <w:rPr>
+                <w:rFonts w:ascii="Calibri" w:hAnsi="Calibri" w:eastAsia="Microsoft YaHei"/>
+                <w:b/>
+                <w:color w:val="17365D"/>
+                <w:sz w:val="18"/>
+              </w:rPr>
+              <w:t>独立模型盲审（已填版）</w:t>
+            </w:r>
+          </w:p>
+        </w:tc>
+      </w:tr>
+      <w:tr>
+        <w:trPr>
+          <w:cantSplit/>
+        </w:trPr>
+        <w:tc>
+          <w:tcPr>
+            <w:tcW w:type="dxa" w:w="3000"/>
+            <w:tcMar>
+              <w:top w:w="80" w:type="dxa"/>
+              <w:start w:w="120" w:type="dxa"/>
+              <w:bottom w:w="80" w:type="dxa"/>
+              <w:end w:w="120" w:type="dxa"/>
+            </w:tcMar>
+            <w:vAlign w:val="center"/>
+          </w:tcPr>
+          <w:p>
+            <w:pPr>
+              <w:spacing w:before="0" w:after="0" w:line="252" w:lineRule="auto"/>
+            </w:pPr>
+            <w:r>
+              <w:rPr>
+                <w:rFonts w:ascii="Calibri" w:hAnsi="Calibri" w:eastAsia="Microsoft YaHei"/>
+                <w:b w:val="0"/>
+                <w:color w:val="333333"/>
+                <w:sz w:val="18"/>
+              </w:rPr>
+              <w:t>一致率</w:t>
+            </w:r>
+          </w:p>
+        </w:tc>
+        <w:tc>
+          <w:tcPr>
+            <w:tcW w:type="dxa" w:w="3180"/>
+            <w:tcMar>
+              <w:top w:w="80" w:type="dxa"/>
+              <w:start w:w="120" w:type="dxa"/>
+              <w:bottom w:w="80" w:type="dxa"/>
+              <w:end w:w="120" w:type="dxa"/>
+            </w:tcMar>
+            <w:vAlign w:val="center"/>
+          </w:tcPr>
+          <w:p>
+            <w:pPr>
+              <w:spacing w:before="0" w:after="0" w:line="252" w:lineRule="auto"/>
+              <w:jc w:val="left"/>
+            </w:pPr>
+            <w:r>
+              <w:rPr>
+                <w:rFonts w:ascii="Calibri" w:hAnsi="Calibri" w:eastAsia="Microsoft YaHei"/>
+                <w:b w:val="0"/>
+                <w:color w:val="333333"/>
+                <w:sz w:val="18"/>
+              </w:rPr>
+              <w:t>93.5%</w:t>
+            </w:r>
+          </w:p>
+        </w:tc>
+        <w:tc>
+          <w:tcPr>
+            <w:tcW w:type="dxa" w:w="3180"/>
+            <w:tcMar>
+              <w:top w:w="80" w:type="dxa"/>
+              <w:start w:w="120" w:type="dxa"/>
+              <w:bottom w:w="80" w:type="dxa"/>
+              <w:end w:w="120" w:type="dxa"/>
+            </w:tcMar>
+            <w:vAlign w:val="center"/>
+          </w:tcPr>
+          <w:p>
+            <w:pPr>
+              <w:spacing w:before="0" w:after="0" w:line="252" w:lineRule="auto"/>
+              <w:jc w:val="left"/>
+            </w:pPr>
+            <w:r>
+              <w:rPr>
+                <w:rFonts w:ascii="Calibri" w:hAnsi="Calibri" w:eastAsia="Microsoft YaHei"/>
+                <w:b w:val="0"/>
+                <w:color w:val="333333"/>
+                <w:sz w:val="18"/>
+              </w:rPr>
+              <w:t>79.5%</w:t>
+            </w:r>
+          </w:p>
+        </w:tc>
+      </w:tr>
+      <w:tr>
+        <w:trPr>
+          <w:cantSplit/>
+        </w:trPr>
+        <w:tc>
+          <w:tcPr>
+            <w:tcW w:type="dxa" w:w="3000"/>
+            <w:tcMar>
+              <w:top w:w="80" w:type="dxa"/>
+              <w:start w:w="120" w:type="dxa"/>
+              <w:bottom w:w="80" w:type="dxa"/>
+              <w:end w:w="120" w:type="dxa"/>
+            </w:tcMar>
+            <w:vAlign w:val="center"/>
+            <w:shd w:fill="F4F8FC"/>
+          </w:tcPr>
+          <w:p>
+            <w:pPr>
+              <w:spacing w:before="0" w:after="0" w:line="252" w:lineRule="auto"/>
+            </w:pPr>
+            <w:r>
+              <w:rPr>
+                <w:rFonts w:ascii="Calibri" w:hAnsi="Calibri" w:eastAsia="Microsoft YaHei"/>
+                <w:b w:val="0"/>
+                <w:color w:val="333333"/>
+                <w:sz w:val="18"/>
+              </w:rPr>
+              <w:t>AI 精确率</w:t>
+            </w:r>
+          </w:p>
+        </w:tc>
+        <w:tc>
+          <w:tcPr>
+            <w:tcW w:type="dxa" w:w="3180"/>
+            <w:tcMar>
+              <w:top w:w="80" w:type="dxa"/>
+              <w:start w:w="120" w:type="dxa"/>
+              <w:bottom w:w="80" w:type="dxa"/>
+              <w:end w:w="120" w:type="dxa"/>
+            </w:tcMar>
+            <w:vAlign w:val="center"/>
+            <w:shd w:fill="F4F8FC"/>
+          </w:tcPr>
+          <w:p>
+            <w:pPr>
+              <w:spacing w:before="0" w:after="0" w:line="252" w:lineRule="auto"/>
+              <w:jc w:val="left"/>
+            </w:pPr>
+            <w:r>
+              <w:rPr>
+                <w:rFonts w:ascii="Calibri" w:hAnsi="Calibri" w:eastAsia="Microsoft YaHei"/>
+                <w:b w:val="0"/>
+                <w:color w:val="333333"/>
+                <w:sz w:val="18"/>
+              </w:rPr>
+              <w:t>88.3%</w:t>
+            </w:r>
+          </w:p>
+        </w:tc>
+        <w:tc>
+          <w:tcPr>
+            <w:tcW w:type="dxa" w:w="3180"/>
+            <w:tcMar>
+              <w:top w:w="80" w:type="dxa"/>
+              <w:start w:w="120" w:type="dxa"/>
+              <w:bottom w:w="80" w:type="dxa"/>
+              <w:end w:w="120" w:type="dxa"/>
+            </w:tcMar>
+            <w:vAlign w:val="center"/>
+            <w:shd w:fill="F4F8FC"/>
+          </w:tcPr>
+          <w:p>
+            <w:pPr>
+              <w:spacing w:before="0" w:after="0" w:line="252" w:lineRule="auto"/>
+              <w:jc w:val="left"/>
+            </w:pPr>
+            <w:r>
+              <w:rPr>
+                <w:rFonts w:ascii="Calibri" w:hAnsi="Calibri" w:eastAsia="Microsoft YaHei"/>
+                <w:b w:val="0"/>
+                <w:color w:val="333333"/>
+                <w:sz w:val="18"/>
+              </w:rPr>
+              <w:t>95.1%</w:t>
+            </w:r>
+          </w:p>
+        </w:tc>
+      </w:tr>
+      <w:tr>
+        <w:trPr>
+          <w:cantSplit/>
+        </w:trPr>
+        <w:tc>
+          <w:tcPr>
+            <w:tcW w:type="dxa" w:w="3000"/>
+            <w:tcMar>
+              <w:top w:w="80" w:type="dxa"/>
+              <w:start w:w="120" w:type="dxa"/>
+              <w:bottom w:w="80" w:type="dxa"/>
+              <w:end w:w="120" w:type="dxa"/>
+            </w:tcMar>
+            <w:vAlign w:val="center"/>
+          </w:tcPr>
+          <w:p>
+            <w:pPr>
+              <w:spacing w:before="0" w:after="0" w:line="252" w:lineRule="auto"/>
+            </w:pPr>
+            <w:r>
+              <w:rPr>
+                <w:rFonts w:ascii="Calibri" w:hAnsi="Calibri" w:eastAsia="Microsoft YaHei"/>
+                <w:b w:val="0"/>
+                <w:color w:val="333333"/>
+                <w:sz w:val="18"/>
+              </w:rPr>
+              <w:t>AI 召回率</w:t>
+            </w:r>
+          </w:p>
+        </w:tc>
+        <w:tc>
+          <w:tcPr>
+            <w:tcW w:type="dxa" w:w="3180"/>
+            <w:tcMar>
+              <w:top w:w="80" w:type="dxa"/>
+              <w:start w:w="120" w:type="dxa"/>
+              <w:bottom w:w="80" w:type="dxa"/>
+              <w:end w:w="120" w:type="dxa"/>
+            </w:tcMar>
+            <w:vAlign w:val="center"/>
+          </w:tcPr>
+          <w:p>
+            <w:pPr>
+              <w:spacing w:before="0" w:after="0" w:line="252" w:lineRule="auto"/>
+              <w:jc w:val="left"/>
+            </w:pPr>
+            <w:r>
+              <w:rPr>
+                <w:rFonts w:ascii="Calibri" w:hAnsi="Calibri" w:eastAsia="Microsoft YaHei"/>
+                <w:b w:val="0"/>
+                <w:color w:val="333333"/>
+                <w:sz w:val="18"/>
+              </w:rPr>
+              <w:t>94.8%</w:t>
+            </w:r>
+          </w:p>
+        </w:tc>
+        <w:tc>
+          <w:tcPr>
+            <w:tcW w:type="dxa" w:w="3180"/>
+            <w:tcMar>
+              <w:top w:w="80" w:type="dxa"/>
+              <w:start w:w="120" w:type="dxa"/>
+              <w:bottom w:w="80" w:type="dxa"/>
+              <w:end w:w="120" w:type="dxa"/>
+            </w:tcMar>
+            <w:vAlign w:val="center"/>
+          </w:tcPr>
+          <w:p>
+            <w:pPr>
+              <w:spacing w:before="0" w:after="0" w:line="252" w:lineRule="auto"/>
+              <w:jc w:val="left"/>
+            </w:pPr>
+            <w:r>
+              <w:rPr>
+                <w:rFonts w:ascii="Calibri" w:hAnsi="Calibri" w:eastAsia="Microsoft YaHei"/>
+                <w:b w:val="0"/>
+                <w:color w:val="333333"/>
+                <w:sz w:val="18"/>
+              </w:rPr>
+              <w:t>66.7%</w:t>
+            </w:r>
+          </w:p>
+        </w:tc>
+      </w:tr>
+      <w:tr>
+        <w:trPr>
+          <w:cantSplit/>
+        </w:trPr>
+        <w:tc>
+          <w:tcPr>
+            <w:tcW w:type="dxa" w:w="3000"/>
+            <w:tcMar>
+              <w:top w:w="80" w:type="dxa"/>
+              <w:start w:w="120" w:type="dxa"/>
+              <w:bottom w:w="80" w:type="dxa"/>
+              <w:end w:w="120" w:type="dxa"/>
+            </w:tcMar>
+            <w:vAlign w:val="center"/>
+            <w:shd w:fill="F4F8FC"/>
+          </w:tcPr>
+          <w:p>
+            <w:pPr>
+              <w:spacing w:before="0" w:after="0" w:line="252" w:lineRule="auto"/>
+            </w:pPr>
+            <w:r>
+              <w:rPr>
+                <w:rFonts w:ascii="Calibri" w:hAnsi="Calibri" w:eastAsia="Microsoft YaHei"/>
+                <w:b w:val="0"/>
+                <w:color w:val="333333"/>
+                <w:sz w:val="18"/>
+              </w:rPr>
+              <w:t>修订披露率</w:t>
+            </w:r>
+          </w:p>
+        </w:tc>
+        <w:tc>
+          <w:tcPr>
+            <w:tcW w:type="dxa" w:w="3180"/>
+            <w:tcMar>
+              <w:top w:w="80" w:type="dxa"/>
+              <w:start w:w="120" w:type="dxa"/>
+              <w:bottom w:w="80" w:type="dxa"/>
+              <w:end w:w="120" w:type="dxa"/>
+            </w:tcMar>
+            <w:vAlign w:val="center"/>
+            <w:shd w:fill="F4F8FC"/>
+          </w:tcPr>
+          <w:p>
+            <w:pPr>
+              <w:spacing w:before="0" w:after="0" w:line="252" w:lineRule="auto"/>
+              <w:jc w:val="left"/>
+            </w:pPr>
+            <w:r>
+              <w:rPr>
+                <w:rFonts w:ascii="Calibri" w:hAnsi="Calibri" w:eastAsia="Microsoft YaHei"/>
+                <w:b w:val="0"/>
+                <w:color w:val="333333"/>
+                <w:sz w:val="18"/>
+              </w:rPr>
+              <w:t>36.4%</w:t>
+            </w:r>
+          </w:p>
+        </w:tc>
+        <w:tc>
+          <w:tcPr>
+            <w:tcW w:type="dxa" w:w="3180"/>
+            <w:tcMar>
+              <w:top w:w="80" w:type="dxa"/>
+              <w:start w:w="120" w:type="dxa"/>
+              <w:bottom w:w="80" w:type="dxa"/>
+              <w:end w:w="120" w:type="dxa"/>
+            </w:tcMar>
+            <w:vAlign w:val="center"/>
+            <w:shd w:fill="F4F8FC"/>
+          </w:tcPr>
+          <w:p>
+            <w:pPr>
+              <w:spacing w:before="0" w:after="0" w:line="252" w:lineRule="auto"/>
+              <w:jc w:val="left"/>
+            </w:pPr>
+            <w:r>
+              <w:rPr>
+                <w:rFonts w:ascii="Calibri" w:hAnsi="Calibri" w:eastAsia="Microsoft YaHei"/>
+                <w:b w:val="0"/>
+                <w:color w:val="333333"/>
+                <w:sz w:val="18"/>
+              </w:rPr>
+              <w:t>55.7%</w:t>
+            </w:r>
+          </w:p>
+        </w:tc>
+      </w:tr>
+    </w:tbl>
+    <w:p>
+      <w:pPr>
+        <w:spacing w:after="0"/>
+      </w:pPr>
+    </w:p>
+    <w:p>
+      <w:r>
+        <w:t>从已填 Excel 回算的加权指标与原始判断完全一致，转换链路已验证。若需人工金标准：真人拿已填版逐条复核（改判直接在表上修改）→ 回传 → 运行转换脚本与 --from-human-queue → 得到最终人工指标。已填版可作为复核基准，但不可冒充人工填写。</w:t>
       </w:r>
     </w:p>
     <w:sectPr>

</xml_diff>